<commit_message>
Design Microwave Transmission Line
[x] - prepared design mode equations for Zo=50Ω (w/d, ε_eff)
[x] - designed TL dimensions and calculated effective relative permittivity
[x] - highlighted wavelength result (guided in mm)
</commit_message>
<xml_diff>
--- a/report.docx
+++ b/report.docx
@@ -1953,6 +1953,643 @@
               <w:color w:val="ADADAD" w:themeColor="background2" w:themeShade="BF"/>
             </w:rPr>
             <m:t>=4.199=6.231dB</m:t>
+          </m:r>
+        </m:oMath>
+      </m:oMathPara>
+    </w:p>
+    <w:p>
+      <w:pPr>
+        <w:rPr>
+          <w:rFonts w:eastAsiaTheme="minorEastAsia"/>
+        </w:rPr>
+      </w:pPr>
+    </w:p>
+    <w:p>
+      <w:pPr>
+        <w:pStyle w:val="Heading1"/>
+        <w:jc w:val="center"/>
+        <w:rPr>
+          <w:rFonts w:eastAsiaTheme="minorEastAsia"/>
+        </w:rPr>
+      </w:pPr>
+      <w:r>
+        <w:rPr>
+          <w:rFonts w:eastAsiaTheme="minorEastAsia"/>
+        </w:rPr>
+        <w:lastRenderedPageBreak/>
+        <w:t>Microstrip TL Design</w:t>
+      </w:r>
+    </w:p>
+    <w:p>
+      <w:pPr>
+        <w:rPr>
+          <w:rFonts w:eastAsiaTheme="minorEastAsia"/>
+        </w:rPr>
+      </w:pPr>
+      <w:r>
+        <w:rPr>
+          <w:rFonts w:eastAsiaTheme="minorEastAsia"/>
+          <w:noProof/>
+        </w:rPr>
+        <w:drawing>
+          <wp:inline distT="0" distB="0" distL="0" distR="0" wp14:anchorId="76731134" wp14:editId="0341F548">
+            <wp:extent cx="5934075" cy="3933825"/>
+            <wp:effectExtent l="0" t="0" r="9525" b="9525"/>
+            <wp:docPr id="542097257" name="Picture 2"/>
+            <wp:cNvGraphicFramePr>
+              <a:graphicFrameLocks xmlns:a="http://schemas.openxmlformats.org/drawingml/2006/main" noChangeAspect="1"/>
+            </wp:cNvGraphicFramePr>
+            <a:graphic xmlns:a="http://schemas.openxmlformats.org/drawingml/2006/main">
+              <a:graphicData uri="http://schemas.openxmlformats.org/drawingml/2006/picture">
+                <pic:pic xmlns:pic="http://schemas.openxmlformats.org/drawingml/2006/picture">
+                  <pic:nvPicPr>
+                    <pic:cNvPr id="0" name="Picture 2"/>
+                    <pic:cNvPicPr>
+                      <a:picLocks noChangeAspect="1" noChangeArrowheads="1"/>
+                    </pic:cNvPicPr>
+                  </pic:nvPicPr>
+                  <pic:blipFill>
+                    <a:blip r:embed="rId9">
+                      <a:extLst>
+                        <a:ext uri="{28A0092B-C50C-407E-A947-70E740481C1C}">
+                          <a14:useLocalDpi xmlns:a14="http://schemas.microsoft.com/office/drawing/2010/main" val="0"/>
+                        </a:ext>
+                      </a:extLst>
+                    </a:blip>
+                    <a:srcRect/>
+                    <a:stretch>
+                      <a:fillRect/>
+                    </a:stretch>
+                  </pic:blipFill>
+                  <pic:spPr bwMode="auto">
+                    <a:xfrm>
+                      <a:off x="0" y="0"/>
+                      <a:ext cx="5934075" cy="3933825"/>
+                    </a:xfrm>
+                    <a:prstGeom prst="rect">
+                      <a:avLst/>
+                    </a:prstGeom>
+                    <a:noFill/>
+                    <a:ln>
+                      <a:noFill/>
+                    </a:ln>
+                  </pic:spPr>
+                </pic:pic>
+              </a:graphicData>
+            </a:graphic>
+          </wp:inline>
+        </w:drawing>
+      </w:r>
+    </w:p>
+    <w:p>
+      <w:pPr>
+        <w:rPr>
+          <w:rFonts w:eastAsiaTheme="minorEastAsia"/>
+        </w:rPr>
+      </w:pPr>
+    </w:p>
+    <w:p>
+      <w:pPr>
+        <w:rPr>
+          <w:rFonts w:eastAsiaTheme="minorEastAsia"/>
+          <w:strike/>
+        </w:rPr>
+      </w:pPr>
+      <m:oMathPara>
+        <m:oMath>
+          <m:r>
+            <w:rPr>
+              <w:rFonts w:ascii="Cambria Math" w:eastAsiaTheme="minorEastAsia" w:hAnsi="Cambria Math"/>
+              <w:strike/>
+            </w:rPr>
+            <m:t>A=1.159→</m:t>
+          </m:r>
+          <m:f>
+            <m:fPr>
+              <m:ctrlPr>
+                <w:rPr>
+                  <w:rFonts w:ascii="Cambria Math" w:eastAsiaTheme="minorEastAsia" w:hAnsi="Cambria Math"/>
+                  <w:i/>
+                  <w:strike/>
+                </w:rPr>
+              </m:ctrlPr>
+            </m:fPr>
+            <m:num>
+              <m:r>
+                <w:rPr>
+                  <w:rFonts w:ascii="Cambria Math" w:eastAsiaTheme="minorEastAsia" w:hAnsi="Cambria Math"/>
+                  <w:strike/>
+                </w:rPr>
+                <m:t>W</m:t>
+              </m:r>
+            </m:num>
+            <m:den>
+              <m:r>
+                <w:rPr>
+                  <w:rFonts w:ascii="Cambria Math" w:eastAsiaTheme="minorEastAsia" w:hAnsi="Cambria Math"/>
+                  <w:strike/>
+                </w:rPr>
+                <m:t>d</m:t>
+              </m:r>
+            </m:den>
+          </m:f>
+          <m:r>
+            <w:rPr>
+              <w:rFonts w:ascii="Cambria Math" w:eastAsiaTheme="minorEastAsia" w:hAnsi="Cambria Math"/>
+              <w:strike/>
+            </w:rPr>
+            <m:t xml:space="preserve">=3.126≮2 </m:t>
+          </m:r>
+          <m:d>
+            <m:dPr>
+              <m:ctrlPr>
+                <w:rPr>
+                  <w:rFonts w:ascii="Cambria Math" w:eastAsiaTheme="minorEastAsia" w:hAnsi="Cambria Math"/>
+                  <w:i/>
+                  <w:strike/>
+                </w:rPr>
+              </m:ctrlPr>
+            </m:dPr>
+            <m:e>
+              <m:r>
+                <w:rPr>
+                  <w:rFonts w:ascii="Cambria Math" w:eastAsiaTheme="minorEastAsia" w:hAnsi="Cambria Math"/>
+                  <w:strike/>
+                </w:rPr>
+                <m:t>rejected</m:t>
+              </m:r>
+            </m:e>
+          </m:d>
+        </m:oMath>
+      </m:oMathPara>
+    </w:p>
+    <w:p>
+      <w:pPr>
+        <w:rPr>
+          <w:rFonts w:eastAsiaTheme="minorEastAsia"/>
+        </w:rPr>
+      </w:pPr>
+      <m:oMathPara>
+        <m:oMath>
+          <m:r>
+            <w:rPr>
+              <w:rFonts w:ascii="Cambria Math" w:eastAsiaTheme="minorEastAsia" w:hAnsi="Cambria Math"/>
+            </w:rPr>
+            <m:t>B=7.985→</m:t>
+          </m:r>
+          <m:f>
+            <m:fPr>
+              <m:ctrlPr>
+                <w:rPr>
+                  <w:rFonts w:ascii="Cambria Math" w:eastAsiaTheme="minorEastAsia" w:hAnsi="Cambria Math"/>
+                  <w:i/>
+                  <w:color w:val="0070C0"/>
+                </w:rPr>
+              </m:ctrlPr>
+            </m:fPr>
+            <m:num>
+              <m:r>
+                <w:rPr>
+                  <w:rFonts w:ascii="Cambria Math" w:eastAsiaTheme="minorEastAsia" w:hAnsi="Cambria Math"/>
+                  <w:color w:val="0070C0"/>
+                </w:rPr>
+                <m:t>W</m:t>
+              </m:r>
+            </m:num>
+            <m:den>
+              <m:r>
+                <w:rPr>
+                  <w:rFonts w:ascii="Cambria Math" w:eastAsiaTheme="minorEastAsia" w:hAnsi="Cambria Math"/>
+                  <w:color w:val="0070C0"/>
+                </w:rPr>
+                <m:t>d</m:t>
+              </m:r>
+            </m:den>
+          </m:f>
+          <m:r>
+            <w:rPr>
+              <w:rFonts w:ascii="Cambria Math" w:eastAsiaTheme="minorEastAsia" w:hAnsi="Cambria Math"/>
+              <w:color w:val="0070C0"/>
+            </w:rPr>
+            <m:t>=3.081</m:t>
+          </m:r>
+          <m:r>
+            <w:rPr>
+              <w:rFonts w:ascii="Cambria Math" w:eastAsiaTheme="minorEastAsia" w:hAnsi="Cambria Math"/>
+            </w:rPr>
+            <m:t>&gt;2</m:t>
+          </m:r>
+        </m:oMath>
+      </m:oMathPara>
+    </w:p>
+    <w:p>
+      <w:pPr>
+        <w:rPr>
+          <w:rFonts w:eastAsiaTheme="minorEastAsia"/>
+        </w:rPr>
+      </w:pPr>
+    </w:p>
+    <w:p>
+      <w:pPr>
+        <w:jc w:val="center"/>
+        <w:rPr>
+          <w:rFonts w:eastAsiaTheme="minorEastAsia"/>
+        </w:rPr>
+      </w:pPr>
+      <w:r>
+        <w:rPr>
+          <w:rFonts w:eastAsiaTheme="minorEastAsia"/>
+          <w:noProof/>
+        </w:rPr>
+        <w:lastRenderedPageBreak/>
+        <w:drawing>
+          <wp:inline distT="0" distB="0" distL="0" distR="0" wp14:anchorId="7279F000" wp14:editId="0B5F371D">
+            <wp:extent cx="4752975" cy="2448965"/>
+            <wp:effectExtent l="0" t="0" r="0" b="8890"/>
+            <wp:docPr id="58730525" name="Picture 3"/>
+            <wp:cNvGraphicFramePr>
+              <a:graphicFrameLocks xmlns:a="http://schemas.openxmlformats.org/drawingml/2006/main" noChangeAspect="1"/>
+            </wp:cNvGraphicFramePr>
+            <a:graphic xmlns:a="http://schemas.openxmlformats.org/drawingml/2006/main">
+              <a:graphicData uri="http://schemas.openxmlformats.org/drawingml/2006/picture">
+                <pic:pic xmlns:pic="http://schemas.openxmlformats.org/drawingml/2006/picture">
+                  <pic:nvPicPr>
+                    <pic:cNvPr id="0" name="Picture 3"/>
+                    <pic:cNvPicPr>
+                      <a:picLocks noChangeAspect="1" noChangeArrowheads="1"/>
+                    </pic:cNvPicPr>
+                  </pic:nvPicPr>
+                  <pic:blipFill>
+                    <a:blip r:embed="rId10">
+                      <a:extLst>
+                        <a:ext uri="{28A0092B-C50C-407E-A947-70E740481C1C}">
+                          <a14:useLocalDpi xmlns:a14="http://schemas.microsoft.com/office/drawing/2010/main" val="0"/>
+                        </a:ext>
+                      </a:extLst>
+                    </a:blip>
+                    <a:srcRect/>
+                    <a:stretch>
+                      <a:fillRect/>
+                    </a:stretch>
+                  </pic:blipFill>
+                  <pic:spPr bwMode="auto">
+                    <a:xfrm>
+                      <a:off x="0" y="0"/>
+                      <a:ext cx="4777204" cy="2461449"/>
+                    </a:xfrm>
+                    <a:prstGeom prst="rect">
+                      <a:avLst/>
+                    </a:prstGeom>
+                    <a:noFill/>
+                    <a:ln>
+                      <a:noFill/>
+                    </a:ln>
+                  </pic:spPr>
+                </pic:pic>
+              </a:graphicData>
+            </a:graphic>
+          </wp:inline>
+        </w:drawing>
+      </w:r>
+    </w:p>
+    <w:p>
+      <w:pPr>
+        <w:rPr>
+          <w:rFonts w:eastAsiaTheme="minorEastAsia"/>
+        </w:rPr>
+      </w:pPr>
+    </w:p>
+    <w:p>
+      <w:pPr>
+        <w:rPr>
+          <w:rFonts w:eastAsiaTheme="minorEastAsia"/>
+        </w:rPr>
+      </w:pPr>
+      <m:oMathPara>
+        <m:oMath>
+          <m:sSub>
+            <m:sSubPr>
+              <m:ctrlPr>
+                <w:rPr>
+                  <w:rFonts w:ascii="Cambria Math" w:eastAsiaTheme="minorEastAsia" w:hAnsi="Cambria Math"/>
+                  <w:i/>
+                  <w:color w:val="0070C0"/>
+                </w:rPr>
+              </m:ctrlPr>
+            </m:sSubPr>
+            <m:e>
+              <m:r>
+                <w:rPr>
+                  <w:rFonts w:ascii="Cambria Math" w:eastAsiaTheme="minorEastAsia" w:hAnsi="Cambria Math"/>
+                  <w:color w:val="0070C0"/>
+                </w:rPr>
+                <m:t>ε</m:t>
+              </m:r>
+            </m:e>
+            <m:sub>
+              <m:r>
+                <w:rPr>
+                  <w:rFonts w:ascii="Cambria Math" w:eastAsiaTheme="minorEastAsia" w:hAnsi="Cambria Math"/>
+                  <w:color w:val="0070C0"/>
+                </w:rPr>
+                <m:t>eff</m:t>
+              </m:r>
+            </m:sub>
+          </m:sSub>
+          <m:r>
+            <w:rPr>
+              <w:rFonts w:ascii="Cambria Math" w:eastAsiaTheme="minorEastAsia" w:hAnsi="Cambria Math"/>
+              <w:color w:val="0070C0"/>
+            </w:rPr>
+            <m:t>=1.871</m:t>
+          </m:r>
+        </m:oMath>
+      </m:oMathPara>
+    </w:p>
+    <w:p>
+      <w:pPr>
+        <w:rPr>
+          <w:rFonts w:eastAsiaTheme="minorEastAsia"/>
+        </w:rPr>
+      </w:pPr>
+      <m:oMathPara>
+        <m:oMath>
+          <m:r>
+            <w:rPr>
+              <w:rFonts w:ascii="Cambria Math" w:eastAsiaTheme="minorEastAsia" w:hAnsi="Cambria Math"/>
+            </w:rPr>
+            <m:t>λ=</m:t>
+          </m:r>
+          <m:sSub>
+            <m:sSubPr>
+              <m:ctrlPr>
+                <w:rPr>
+                  <w:rFonts w:ascii="Cambria Math" w:eastAsiaTheme="minorEastAsia" w:hAnsi="Cambria Math"/>
+                  <w:i/>
+                </w:rPr>
+              </m:ctrlPr>
+            </m:sSubPr>
+            <m:e>
+              <m:r>
+                <w:rPr>
+                  <w:rFonts w:ascii="Cambria Math" w:eastAsiaTheme="minorEastAsia" w:hAnsi="Cambria Math"/>
+                </w:rPr>
+                <m:t>λ</m:t>
+              </m:r>
+            </m:e>
+            <m:sub>
+              <m:r>
+                <w:rPr>
+                  <w:rFonts w:ascii="Cambria Math" w:eastAsiaTheme="minorEastAsia" w:hAnsi="Cambria Math"/>
+                </w:rPr>
+                <m:t>g</m:t>
+              </m:r>
+            </m:sub>
+          </m:sSub>
+          <m:r>
+            <w:rPr>
+              <w:rFonts w:ascii="Cambria Math" w:eastAsiaTheme="minorEastAsia" w:hAnsi="Cambria Math"/>
+            </w:rPr>
+            <m:t>=</m:t>
+          </m:r>
+          <m:f>
+            <m:fPr>
+              <m:ctrlPr>
+                <w:rPr>
+                  <w:rFonts w:ascii="Cambria Math" w:eastAsiaTheme="minorEastAsia" w:hAnsi="Cambria Math"/>
+                  <w:i/>
+                </w:rPr>
+              </m:ctrlPr>
+            </m:fPr>
+            <m:num>
+              <m:sSub>
+                <m:sSubPr>
+                  <m:ctrlPr>
+                    <w:rPr>
+                      <w:rFonts w:ascii="Cambria Math" w:eastAsiaTheme="minorEastAsia" w:hAnsi="Cambria Math"/>
+                      <w:i/>
+                    </w:rPr>
+                  </m:ctrlPr>
+                </m:sSubPr>
+                <m:e>
+                  <m:r>
+                    <w:rPr>
+                      <w:rFonts w:ascii="Cambria Math" w:eastAsiaTheme="minorEastAsia" w:hAnsi="Cambria Math"/>
+                    </w:rPr>
+                    <m:t>λ</m:t>
+                  </m:r>
+                </m:e>
+                <m:sub>
+                  <m:r>
+                    <w:rPr>
+                      <w:rFonts w:ascii="Cambria Math" w:eastAsiaTheme="minorEastAsia" w:hAnsi="Cambria Math"/>
+                    </w:rPr>
+                    <m:t>o</m:t>
+                  </m:r>
+                </m:sub>
+              </m:sSub>
+            </m:num>
+            <m:den>
+              <m:rad>
+                <m:radPr>
+                  <m:degHide m:val="1"/>
+                  <m:ctrlPr>
+                    <w:rPr>
+                      <w:rFonts w:ascii="Cambria Math" w:eastAsiaTheme="minorEastAsia" w:hAnsi="Cambria Math"/>
+                      <w:i/>
+                    </w:rPr>
+                  </m:ctrlPr>
+                </m:radPr>
+                <m:deg/>
+                <m:e>
+                  <m:sSub>
+                    <m:sSubPr>
+                      <m:ctrlPr>
+                        <w:rPr>
+                          <w:rFonts w:ascii="Cambria Math" w:eastAsiaTheme="minorEastAsia" w:hAnsi="Cambria Math"/>
+                          <w:i/>
+                        </w:rPr>
+                      </m:ctrlPr>
+                    </m:sSubPr>
+                    <m:e>
+                      <m:r>
+                        <w:rPr>
+                          <w:rFonts w:ascii="Cambria Math" w:eastAsiaTheme="minorEastAsia" w:hAnsi="Cambria Math"/>
+                        </w:rPr>
+                        <m:t>ε</m:t>
+                      </m:r>
+                    </m:e>
+                    <m:sub>
+                      <m:r>
+                        <w:rPr>
+                          <w:rFonts w:ascii="Cambria Math" w:eastAsiaTheme="minorEastAsia" w:hAnsi="Cambria Math"/>
+                        </w:rPr>
+                        <m:t>eff</m:t>
+                      </m:r>
+                    </m:sub>
+                  </m:sSub>
+                </m:e>
+              </m:rad>
+            </m:den>
+          </m:f>
+          <m:r>
+            <w:rPr>
+              <w:rFonts w:ascii="Cambria Math" w:eastAsiaTheme="minorEastAsia" w:hAnsi="Cambria Math"/>
+            </w:rPr>
+            <m:t>=</m:t>
+          </m:r>
+          <m:f>
+            <m:fPr>
+              <m:ctrlPr>
+                <w:rPr>
+                  <w:rFonts w:ascii="Cambria Math" w:eastAsiaTheme="minorEastAsia" w:hAnsi="Cambria Math"/>
+                  <w:i/>
+                </w:rPr>
+              </m:ctrlPr>
+            </m:fPr>
+            <m:num>
+              <m:sSub>
+                <m:sSubPr>
+                  <m:ctrlPr>
+                    <w:rPr>
+                      <w:rFonts w:ascii="Cambria Math" w:eastAsiaTheme="minorEastAsia" w:hAnsi="Cambria Math"/>
+                      <w:i/>
+                    </w:rPr>
+                  </m:ctrlPr>
+                </m:sSubPr>
+                <m:e>
+                  <m:r>
+                    <w:rPr>
+                      <w:rFonts w:ascii="Cambria Math" w:eastAsiaTheme="minorEastAsia" w:hAnsi="Cambria Math"/>
+                    </w:rPr>
+                    <m:t>c</m:t>
+                  </m:r>
+                </m:e>
+                <m:sub>
+                  <m:r>
+                    <w:rPr>
+                      <w:rFonts w:ascii="Cambria Math" w:eastAsiaTheme="minorEastAsia" w:hAnsi="Cambria Math"/>
+                    </w:rPr>
+                    <m:t>o</m:t>
+                  </m:r>
+                </m:sub>
+              </m:sSub>
+            </m:num>
+            <m:den>
+              <m:r>
+                <w:rPr>
+                  <w:rFonts w:ascii="Cambria Math" w:eastAsiaTheme="minorEastAsia" w:hAnsi="Cambria Math"/>
+                </w:rPr>
+                <m:t>f</m:t>
+              </m:r>
+              <m:rad>
+                <m:radPr>
+                  <m:degHide m:val="1"/>
+                  <m:ctrlPr>
+                    <w:rPr>
+                      <w:rFonts w:ascii="Cambria Math" w:eastAsiaTheme="minorEastAsia" w:hAnsi="Cambria Math"/>
+                      <w:i/>
+                    </w:rPr>
+                  </m:ctrlPr>
+                </m:radPr>
+                <m:deg/>
+                <m:e>
+                  <m:sSub>
+                    <m:sSubPr>
+                      <m:ctrlPr>
+                        <w:rPr>
+                          <w:rFonts w:ascii="Cambria Math" w:eastAsiaTheme="minorEastAsia" w:hAnsi="Cambria Math"/>
+                          <w:i/>
+                        </w:rPr>
+                      </m:ctrlPr>
+                    </m:sSubPr>
+                    <m:e>
+                      <m:r>
+                        <w:rPr>
+                          <w:rFonts w:ascii="Cambria Math" w:eastAsiaTheme="minorEastAsia" w:hAnsi="Cambria Math"/>
+                        </w:rPr>
+                        <m:t>ε</m:t>
+                      </m:r>
+                    </m:e>
+                    <m:sub>
+                      <m:r>
+                        <w:rPr>
+                          <w:rFonts w:ascii="Cambria Math" w:eastAsiaTheme="minorEastAsia" w:hAnsi="Cambria Math"/>
+                        </w:rPr>
+                        <m:t>eff</m:t>
+                      </m:r>
+                    </m:sub>
+                  </m:sSub>
+                </m:e>
+              </m:rad>
+            </m:den>
+          </m:f>
+          <m:r>
+            <w:rPr>
+              <w:rFonts w:ascii="Cambria Math" w:eastAsiaTheme="minorEastAsia" w:hAnsi="Cambria Math"/>
+            </w:rPr>
+            <m:t>=0.023069m</m:t>
+          </m:r>
+        </m:oMath>
+      </m:oMathPara>
+    </w:p>
+    <w:p>
+      <w:pPr>
+        <w:rPr>
+          <w:rFonts w:eastAsiaTheme="minorEastAsia"/>
+        </w:rPr>
+      </w:pPr>
+      <m:oMathPara>
+        <m:oMath>
+          <m:r>
+            <w:rPr>
+              <w:rFonts w:ascii="Cambria Math" w:eastAsiaTheme="minorEastAsia" w:hAnsi="Cambria Math"/>
+              <w:color w:val="0070C0"/>
+            </w:rPr>
+            <m:t>λ=23.069mm</m:t>
+          </m:r>
+          <m:r>
+            <w:rPr>
+              <w:rFonts w:ascii="Cambria Math" w:eastAsiaTheme="minorEastAsia" w:hAnsi="Cambria Math"/>
+              <w:color w:val="0070C0"/>
+            </w:rPr>
+            <m:t>→</m:t>
+          </m:r>
+          <m:f>
+            <m:fPr>
+              <m:ctrlPr>
+                <w:rPr>
+                  <w:rFonts w:ascii="Cambria Math" w:eastAsiaTheme="minorEastAsia" w:hAnsi="Cambria Math"/>
+                  <w:i/>
+                  <w:color w:val="0070C0"/>
+                </w:rPr>
+              </m:ctrlPr>
+            </m:fPr>
+            <m:num>
+              <m:r>
+                <w:rPr>
+                  <w:rFonts w:ascii="Cambria Math" w:eastAsiaTheme="minorEastAsia" w:hAnsi="Cambria Math"/>
+                  <w:color w:val="0070C0"/>
+                </w:rPr>
+                <m:t>λ</m:t>
+              </m:r>
+            </m:num>
+            <m:den>
+              <m:r>
+                <w:rPr>
+                  <w:rFonts w:ascii="Cambria Math" w:eastAsiaTheme="minorEastAsia" w:hAnsi="Cambria Math"/>
+                  <w:color w:val="0070C0"/>
+                </w:rPr>
+                <m:t>4</m:t>
+              </m:r>
+            </m:den>
+          </m:f>
+          <m:r>
+            <w:rPr>
+              <w:rFonts w:ascii="Cambria Math" w:eastAsiaTheme="minorEastAsia" w:hAnsi="Cambria Math"/>
+              <w:color w:val="0070C0"/>
+            </w:rPr>
+            <m:t>=5.767mm</m:t>
           </m:r>
         </m:oMath>
       </m:oMathPara>

</xml_diff>

<commit_message>
Design and Check Amplifier Matching Network Pair
[x] - sketched reflection coefficients for source and load (Γ_s, Γ_l)
[x] - determined 2 solutions to find stub length for each stub for both matching networks
[x] - chosen the solutions that meet project specs (wider bandwidth = minimum stubs' length)
[x] - implemented python script for calculating stub length
[x] - checked each stub length using TXLine tool
</commit_message>
<xml_diff>
--- a/report.docx
+++ b/report.docx
@@ -2536,7 +2536,9 @@
     <w:p>
       <w:pPr>
         <w:rPr>
-          <w:rFonts w:eastAsiaTheme="minorEastAsia"/>
+          <w:rFonts w:ascii="Cambria Math" w:eastAsiaTheme="minorEastAsia" w:hAnsi="Cambria Math"/>
+          <w:i/>
+          <w:color w:val="0070C0"/>
         </w:rPr>
       </w:pPr>
       <m:oMathPara>
@@ -2546,14 +2548,7 @@
               <w:rFonts w:ascii="Cambria Math" w:eastAsiaTheme="minorEastAsia" w:hAnsi="Cambria Math"/>
               <w:color w:val="0070C0"/>
             </w:rPr>
-            <m:t>λ=23.069mm</m:t>
-          </m:r>
-          <m:r>
-            <w:rPr>
-              <w:rFonts w:ascii="Cambria Math" w:eastAsiaTheme="minorEastAsia" w:hAnsi="Cambria Math"/>
-              <w:color w:val="0070C0"/>
-            </w:rPr>
-            <m:t>→</m:t>
+            <m:t>λ=23.069mm→</m:t>
           </m:r>
           <m:f>
             <m:fPr>
@@ -2593,6 +2588,1836 @@
           </m:r>
         </m:oMath>
       </m:oMathPara>
+    </w:p>
+    <w:p>
+      <w:pPr>
+        <w:rPr>
+          <w:rFonts w:eastAsiaTheme="minorEastAsia"/>
+        </w:rPr>
+      </w:pPr>
+    </w:p>
+    <w:p>
+      <w:pPr>
+        <w:pStyle w:val="Heading2"/>
+        <w:jc w:val="center"/>
+        <w:rPr>
+          <w:rFonts w:eastAsiaTheme="minorEastAsia"/>
+        </w:rPr>
+      </w:pPr>
+      <w:r>
+        <w:rPr>
+          <w:rFonts w:eastAsiaTheme="minorEastAsia"/>
+        </w:rPr>
+        <w:lastRenderedPageBreak/>
+        <w:t xml:space="preserve">Input </w:t>
+      </w:r>
+      <w:r>
+        <w:rPr>
+          <w:rFonts w:eastAsiaTheme="minorEastAsia"/>
+        </w:rPr>
+        <w:t xml:space="preserve">and Output </w:t>
+      </w:r>
+      <w:r>
+        <w:rPr>
+          <w:rFonts w:eastAsiaTheme="minorEastAsia"/>
+        </w:rPr>
+        <w:t>Matching Network</w:t>
+      </w:r>
+    </w:p>
+    <w:tbl>
+      <w:tblPr>
+        <w:tblStyle w:val="TableGrid"/>
+        <w:tblW w:w="0" w:type="auto"/>
+        <w:tblBorders>
+          <w:top w:val="none" w:sz="0" w:space="0" w:color="auto"/>
+          <w:left w:val="none" w:sz="0" w:space="0" w:color="auto"/>
+          <w:bottom w:val="none" w:sz="0" w:space="0" w:color="auto"/>
+          <w:right w:val="none" w:sz="0" w:space="0" w:color="auto"/>
+          <w:insideH w:val="none" w:sz="0" w:space="0" w:color="auto"/>
+          <w:insideV w:val="none" w:sz="0" w:space="0" w:color="auto"/>
+        </w:tblBorders>
+        <w:tblCellMar>
+          <w:left w:w="0" w:type="dxa"/>
+          <w:right w:w="0" w:type="dxa"/>
+        </w:tblCellMar>
+        <w:tblLook w:val="04A0" w:firstRow="1" w:lastRow="0" w:firstColumn="1" w:lastColumn="0" w:noHBand="0" w:noVBand="1"/>
+      </w:tblPr>
+      <w:tblGrid>
+        <w:gridCol w:w="5472"/>
+        <w:gridCol w:w="3888"/>
+      </w:tblGrid>
+      <w:tr>
+        <w:tc>
+          <w:tcPr>
+            <w:tcW w:w="4675" w:type="dxa"/>
+          </w:tcPr>
+          <w:p>
+            <w:pPr>
+              <w:rPr>
+                <w:rFonts w:eastAsiaTheme="minorEastAsia"/>
+              </w:rPr>
+            </w:pPr>
+            <w:r>
+              <w:rPr>
+                <w:rFonts w:eastAsiaTheme="minorEastAsia"/>
+                <w:noProof/>
+              </w:rPr>
+              <w:drawing>
+                <wp:inline distT="0" distB="0" distL="0" distR="0" wp14:anchorId="04DDC3AF" wp14:editId="0A501876">
+                  <wp:extent cx="3474720" cy="3844371"/>
+                  <wp:effectExtent l="0" t="0" r="0" b="3810"/>
+                  <wp:docPr id="905543199" name="Picture 6"/>
+                  <wp:cNvGraphicFramePr>
+                    <a:graphicFrameLocks xmlns:a="http://schemas.openxmlformats.org/drawingml/2006/main" noChangeAspect="1"/>
+                  </wp:cNvGraphicFramePr>
+                  <a:graphic xmlns:a="http://schemas.openxmlformats.org/drawingml/2006/main">
+                    <a:graphicData uri="http://schemas.openxmlformats.org/drawingml/2006/picture">
+                      <pic:pic xmlns:pic="http://schemas.openxmlformats.org/drawingml/2006/picture">
+                        <pic:nvPicPr>
+                          <pic:cNvPr id="905543199" name="Picture 905543199"/>
+                          <pic:cNvPicPr/>
+                        </pic:nvPicPr>
+                        <pic:blipFill rotWithShape="1">
+                          <a:blip r:embed="rId11" cstate="print">
+                            <a:extLst>
+                              <a:ext uri="{28A0092B-C50C-407E-A947-70E740481C1C}">
+                                <a14:useLocalDpi xmlns:a14="http://schemas.microsoft.com/office/drawing/2010/main" val="0"/>
+                              </a:ext>
+                            </a:extLst>
+                          </a:blip>
+                          <a:srcRect l="5470" t="4735" r="8849" b="4568"/>
+                          <a:stretch>
+                            <a:fillRect/>
+                          </a:stretch>
+                        </pic:blipFill>
+                        <pic:spPr bwMode="auto">
+                          <a:xfrm>
+                            <a:off x="0" y="0"/>
+                            <a:ext cx="3474720" cy="3844371"/>
+                          </a:xfrm>
+                          <a:prstGeom prst="rect">
+                            <a:avLst/>
+                          </a:prstGeom>
+                          <a:ln>
+                            <a:noFill/>
+                          </a:ln>
+                          <a:extLst>
+                            <a:ext uri="{53640926-AAD7-44D8-BBD7-CCE9431645EC}">
+                              <a14:shadowObscured xmlns:a14="http://schemas.microsoft.com/office/drawing/2010/main"/>
+                            </a:ext>
+                          </a:extLst>
+                        </pic:spPr>
+                      </pic:pic>
+                    </a:graphicData>
+                  </a:graphic>
+                </wp:inline>
+              </w:drawing>
+            </w:r>
+          </w:p>
+        </w:tc>
+        <w:tc>
+          <w:tcPr>
+            <w:tcW w:w="4675" w:type="dxa"/>
+            <w:vAlign w:val="center"/>
+          </w:tcPr>
+          <w:p>
+            <w:pPr>
+              <w:ind w:left="420"/>
+              <w:jc w:val="both"/>
+              <w:rPr>
+                <w:rFonts w:eastAsiaTheme="minorEastAsia"/>
+                <w:b/>
+                <w:bCs/>
+                <w:u w:val="single"/>
+              </w:rPr>
+            </w:pPr>
+            <w:r>
+              <w:rPr>
+                <w:rFonts w:eastAsiaTheme="minorEastAsia"/>
+                <w:b/>
+                <w:bCs/>
+                <w:u w:val="single"/>
+              </w:rPr>
+              <w:t>Solution1</w:t>
+            </w:r>
+          </w:p>
+          <w:p>
+            <w:pPr>
+              <w:ind w:left="420"/>
+              <w:jc w:val="both"/>
+              <w:rPr>
+                <w:rFonts w:eastAsiaTheme="minorEastAsia"/>
+              </w:rPr>
+            </w:pPr>
+          </w:p>
+          <w:p>
+            <w:pPr>
+              <w:ind w:left="420"/>
+              <w:jc w:val="both"/>
+              <w:rPr>
+                <w:rFonts w:eastAsiaTheme="minorEastAsia"/>
+              </w:rPr>
+            </w:pPr>
+            <m:oMathPara>
+              <m:oMathParaPr>
+                <m:jc m:val="left"/>
+              </m:oMathParaPr>
+              <m:oMath>
+                <m:r>
+                  <w:rPr>
+                    <w:rFonts w:ascii="Cambria Math" w:eastAsiaTheme="minorEastAsia" w:hAnsi="Cambria Math"/>
+                  </w:rPr>
+                  <m:t>l=0.162λ-0λ</m:t>
+                </m:r>
+              </m:oMath>
+            </m:oMathPara>
+          </w:p>
+          <w:p>
+            <w:pPr>
+              <w:ind w:left="420"/>
+              <w:jc w:val="both"/>
+              <w:rPr>
+                <w:rFonts w:eastAsiaTheme="minorEastAsia"/>
+              </w:rPr>
+            </w:pPr>
+            <m:oMathPara>
+              <m:oMathParaPr>
+                <m:jc m:val="left"/>
+              </m:oMathParaPr>
+              <m:oMath>
+                <m:r>
+                  <w:rPr>
+                    <w:rFonts w:ascii="Cambria Math" w:eastAsiaTheme="minorEastAsia" w:hAnsi="Cambria Math"/>
+                  </w:rPr>
+                  <m:t>l=0.162λ+</m:t>
+                </m:r>
+                <m:f>
+                  <m:fPr>
+                    <m:ctrlPr>
+                      <w:rPr>
+                        <w:rFonts w:ascii="Cambria Math" w:eastAsiaTheme="minorEastAsia" w:hAnsi="Cambria Math"/>
+                        <w:i/>
+                      </w:rPr>
+                    </m:ctrlPr>
+                  </m:fPr>
+                  <m:num>
+                    <m:r>
+                      <w:rPr>
+                        <w:rFonts w:ascii="Cambria Math" w:eastAsiaTheme="minorEastAsia" w:hAnsi="Cambria Math"/>
+                      </w:rPr>
+                      <m:t>mλ</m:t>
+                    </m:r>
+                  </m:num>
+                  <m:den>
+                    <m:r>
+                      <w:rPr>
+                        <w:rFonts w:ascii="Cambria Math" w:eastAsiaTheme="minorEastAsia" w:hAnsi="Cambria Math"/>
+                      </w:rPr>
+                      <m:t>2</m:t>
+                    </m:r>
+                  </m:den>
+                </m:f>
+                <m:r>
+                  <w:rPr>
+                    <w:rFonts w:ascii="Cambria Math" w:eastAsiaTheme="minorEastAsia" w:hAnsi="Cambria Math"/>
+                  </w:rPr>
+                  <m:t>, m=0</m:t>
+                </m:r>
+                <m:r>
+                  <w:rPr>
+                    <w:rFonts w:ascii="Cambria Math" w:eastAsiaTheme="minorEastAsia" w:hAnsi="Cambria Math"/>
+                    <w:color w:val="ADADAD" w:themeColor="background2" w:themeShade="BF"/>
+                  </w:rPr>
+                  <m:t>, 1, 2, …</m:t>
+                </m:r>
+              </m:oMath>
+            </m:oMathPara>
+          </w:p>
+          <w:p>
+            <w:pPr>
+              <w:ind w:left="420"/>
+              <w:jc w:val="both"/>
+              <w:rPr>
+                <w:rFonts w:eastAsiaTheme="minorEastAsia"/>
+              </w:rPr>
+            </w:pPr>
+            <m:oMathPara>
+              <m:oMathParaPr>
+                <m:jc m:val="left"/>
+              </m:oMathParaPr>
+              <m:oMath>
+                <m:r>
+                  <w:rPr>
+                    <w:rFonts w:ascii="Cambria Math" w:eastAsiaTheme="minorEastAsia" w:hAnsi="Cambria Math"/>
+                  </w:rPr>
+                  <m:t>l=0.162λ=58.32°</m:t>
+                </m:r>
+              </m:oMath>
+            </m:oMathPara>
+          </w:p>
+          <w:p>
+            <w:pPr>
+              <w:ind w:left="420"/>
+              <w:jc w:val="both"/>
+              <w:rPr>
+                <w:rFonts w:eastAsiaTheme="minorEastAsia"/>
+              </w:rPr>
+            </w:pPr>
+            <m:oMathPara>
+              <m:oMathParaPr>
+                <m:jc m:val="left"/>
+              </m:oMathParaPr>
+              <m:oMath>
+                <m:r>
+                  <w:rPr>
+                    <w:rFonts w:ascii="Cambria Math" w:eastAsiaTheme="minorEastAsia" w:hAnsi="Cambria Math"/>
+                    <w:color w:val="0070C0"/>
+                  </w:rPr>
+                  <m:t>l=3.737mm</m:t>
+                </m:r>
+              </m:oMath>
+            </m:oMathPara>
+          </w:p>
+          <w:p>
+            <w:pPr>
+              <w:ind w:left="420"/>
+              <w:jc w:val="both"/>
+              <w:rPr>
+                <w:rFonts w:eastAsiaTheme="minorEastAsia"/>
+              </w:rPr>
+            </w:pPr>
+          </w:p>
+          <w:p>
+            <w:pPr>
+              <w:ind w:left="420"/>
+              <w:jc w:val="both"/>
+              <w:rPr>
+                <w:rFonts w:eastAsiaTheme="minorEastAsia"/>
+              </w:rPr>
+            </w:pPr>
+          </w:p>
+          <w:p>
+            <w:pPr>
+              <w:ind w:left="420"/>
+              <w:jc w:val="both"/>
+              <w:rPr>
+                <w:rFonts w:eastAsiaTheme="minorEastAsia"/>
+              </w:rPr>
+            </w:pPr>
+            <m:oMathPara>
+              <m:oMathParaPr>
+                <m:jc m:val="left"/>
+              </m:oMathParaPr>
+              <m:oMath>
+                <m:r>
+                  <w:rPr>
+                    <w:rFonts w:ascii="Cambria Math" w:eastAsiaTheme="minorEastAsia" w:hAnsi="Cambria Math"/>
+                  </w:rPr>
+                  <m:t>d=0.054λ-0.18λ</m:t>
+                </m:r>
+              </m:oMath>
+            </m:oMathPara>
+          </w:p>
+          <w:p>
+            <w:pPr>
+              <w:ind w:left="420"/>
+              <w:jc w:val="both"/>
+              <w:rPr>
+                <w:rFonts w:eastAsiaTheme="minorEastAsia"/>
+              </w:rPr>
+            </w:pPr>
+            <m:oMathPara>
+              <m:oMathParaPr>
+                <m:jc m:val="left"/>
+              </m:oMathParaPr>
+              <m:oMath>
+                <m:r>
+                  <w:rPr>
+                    <w:rFonts w:ascii="Cambria Math" w:eastAsiaTheme="minorEastAsia" w:hAnsi="Cambria Math"/>
+                  </w:rPr>
+                  <m:t>d=-0.126λ</m:t>
+                </m:r>
+              </m:oMath>
+            </m:oMathPara>
+          </w:p>
+          <w:p>
+            <w:pPr>
+              <w:ind w:left="420"/>
+              <w:jc w:val="both"/>
+              <w:rPr>
+                <w:rFonts w:eastAsiaTheme="minorEastAsia"/>
+              </w:rPr>
+            </w:pPr>
+            <m:oMathPara>
+              <m:oMathParaPr>
+                <m:jc m:val="left"/>
+              </m:oMathParaPr>
+              <m:oMath>
+                <m:r>
+                  <w:rPr>
+                    <w:rFonts w:ascii="Cambria Math" w:eastAsiaTheme="minorEastAsia" w:hAnsi="Cambria Math"/>
+                  </w:rPr>
+                  <m:t>d=-0.126λ+0.5λ</m:t>
+                </m:r>
+              </m:oMath>
+            </m:oMathPara>
+          </w:p>
+          <w:p>
+            <w:pPr>
+              <w:ind w:left="420"/>
+              <w:jc w:val="both"/>
+              <w:rPr>
+                <w:rFonts w:eastAsiaTheme="minorEastAsia"/>
+                <w:color w:val="ADADAD" w:themeColor="background2" w:themeShade="BF"/>
+              </w:rPr>
+            </w:pPr>
+            <m:oMathPara>
+              <m:oMathParaPr>
+                <m:jc m:val="left"/>
+              </m:oMathParaPr>
+              <m:oMath>
+                <m:r>
+                  <w:rPr>
+                    <w:rFonts w:ascii="Cambria Math" w:eastAsiaTheme="minorEastAsia" w:hAnsi="Cambria Math"/>
+                  </w:rPr>
+                  <m:t>d=0.374λ+</m:t>
+                </m:r>
+                <m:f>
+                  <m:fPr>
+                    <m:ctrlPr>
+                      <w:rPr>
+                        <w:rFonts w:ascii="Cambria Math" w:eastAsiaTheme="minorEastAsia" w:hAnsi="Cambria Math"/>
+                        <w:i/>
+                      </w:rPr>
+                    </m:ctrlPr>
+                  </m:fPr>
+                  <m:num>
+                    <m:r>
+                      <w:rPr>
+                        <w:rFonts w:ascii="Cambria Math" w:eastAsiaTheme="minorEastAsia" w:hAnsi="Cambria Math"/>
+                      </w:rPr>
+                      <m:t>mλ</m:t>
+                    </m:r>
+                  </m:num>
+                  <m:den>
+                    <m:r>
+                      <w:rPr>
+                        <w:rFonts w:ascii="Cambria Math" w:eastAsiaTheme="minorEastAsia" w:hAnsi="Cambria Math"/>
+                      </w:rPr>
+                      <m:t>2</m:t>
+                    </m:r>
+                  </m:den>
+                </m:f>
+                <m:r>
+                  <w:rPr>
+                    <w:rFonts w:ascii="Cambria Math" w:eastAsiaTheme="minorEastAsia" w:hAnsi="Cambria Math"/>
+                  </w:rPr>
+                  <m:t>,m=0</m:t>
+                </m:r>
+                <m:r>
+                  <w:rPr>
+                    <w:rFonts w:ascii="Cambria Math" w:eastAsiaTheme="minorEastAsia" w:hAnsi="Cambria Math"/>
+                    <w:color w:val="ADADAD" w:themeColor="background2" w:themeShade="BF"/>
+                  </w:rPr>
+                  <m:t>, 1, 2, …</m:t>
+                </m:r>
+              </m:oMath>
+            </m:oMathPara>
+          </w:p>
+          <w:p>
+            <w:pPr>
+              <w:ind w:left="420"/>
+              <w:jc w:val="both"/>
+              <w:rPr>
+                <w:rFonts w:eastAsiaTheme="minorEastAsia"/>
+              </w:rPr>
+            </w:pPr>
+            <m:oMathPara>
+              <m:oMathParaPr>
+                <m:jc m:val="left"/>
+              </m:oMathParaPr>
+              <m:oMath>
+                <m:r>
+                  <w:rPr>
+                    <w:rFonts w:ascii="Cambria Math" w:eastAsiaTheme="minorEastAsia" w:hAnsi="Cambria Math"/>
+                  </w:rPr>
+                  <m:t>d=0.374λ=134.64°</m:t>
+                </m:r>
+              </m:oMath>
+            </m:oMathPara>
+          </w:p>
+          <w:p>
+            <w:pPr>
+              <w:ind w:left="420"/>
+              <w:jc w:val="both"/>
+              <w:rPr>
+                <w:rFonts w:eastAsiaTheme="minorEastAsia"/>
+              </w:rPr>
+            </w:pPr>
+            <m:oMathPara>
+              <m:oMathParaPr>
+                <m:jc m:val="left"/>
+              </m:oMathParaPr>
+              <m:oMath>
+                <m:r>
+                  <w:rPr>
+                    <w:rFonts w:ascii="Cambria Math" w:eastAsiaTheme="minorEastAsia" w:hAnsi="Cambria Math"/>
+                    <w:color w:val="0070C0"/>
+                  </w:rPr>
+                  <m:t>d=8.628mm</m:t>
+                </m:r>
+              </m:oMath>
+            </m:oMathPara>
+          </w:p>
+        </w:tc>
+      </w:tr>
+      <w:tr>
+        <w:tc>
+          <w:tcPr>
+            <w:tcW w:w="4675" w:type="dxa"/>
+          </w:tcPr>
+          <w:p>
+            <w:pPr>
+              <w:rPr>
+                <w:rFonts w:eastAsiaTheme="minorEastAsia"/>
+              </w:rPr>
+            </w:pPr>
+            <w:r>
+              <w:rPr>
+                <w:rFonts w:eastAsiaTheme="minorEastAsia"/>
+                <w:noProof/>
+              </w:rPr>
+              <w:drawing>
+                <wp:inline distT="0" distB="0" distL="0" distR="0" wp14:anchorId="4D9EFD23" wp14:editId="1D248012">
+                  <wp:extent cx="3474720" cy="3737286"/>
+                  <wp:effectExtent l="0" t="0" r="0" b="0"/>
+                  <wp:docPr id="2097809316" name="Picture 7"/>
+                  <wp:cNvGraphicFramePr>
+                    <a:graphicFrameLocks xmlns:a="http://schemas.openxmlformats.org/drawingml/2006/main" noChangeAspect="1"/>
+                  </wp:cNvGraphicFramePr>
+                  <a:graphic xmlns:a="http://schemas.openxmlformats.org/drawingml/2006/main">
+                    <a:graphicData uri="http://schemas.openxmlformats.org/drawingml/2006/picture">
+                      <pic:pic xmlns:pic="http://schemas.openxmlformats.org/drawingml/2006/picture">
+                        <pic:nvPicPr>
+                          <pic:cNvPr id="2097809316" name="Picture 2097809316"/>
+                          <pic:cNvPicPr/>
+                        </pic:nvPicPr>
+                        <pic:blipFill rotWithShape="1">
+                          <a:blip r:embed="rId12" cstate="print">
+                            <a:alphaModFix amt="50000"/>
+                            <a:extLst>
+                              <a:ext uri="{28A0092B-C50C-407E-A947-70E740481C1C}">
+                                <a14:useLocalDpi xmlns:a14="http://schemas.microsoft.com/office/drawing/2010/main" val="0"/>
+                              </a:ext>
+                            </a:extLst>
+                          </a:blip>
+                          <a:srcRect l="5469" t="5781" r="8562" b="4978"/>
+                          <a:stretch>
+                            <a:fillRect/>
+                          </a:stretch>
+                        </pic:blipFill>
+                        <pic:spPr bwMode="auto">
+                          <a:xfrm>
+                            <a:off x="0" y="0"/>
+                            <a:ext cx="3474720" cy="3737286"/>
+                          </a:xfrm>
+                          <a:prstGeom prst="rect">
+                            <a:avLst/>
+                          </a:prstGeom>
+                          <a:ln>
+                            <a:noFill/>
+                          </a:ln>
+                          <a:extLst>
+                            <a:ext uri="{53640926-AAD7-44D8-BBD7-CCE9431645EC}">
+                              <a14:shadowObscured xmlns:a14="http://schemas.microsoft.com/office/drawing/2010/main"/>
+                            </a:ext>
+                          </a:extLst>
+                        </pic:spPr>
+                      </pic:pic>
+                    </a:graphicData>
+                  </a:graphic>
+                </wp:inline>
+              </w:drawing>
+            </w:r>
+          </w:p>
+        </w:tc>
+        <w:tc>
+          <w:tcPr>
+            <w:tcW w:w="4675" w:type="dxa"/>
+            <w:vAlign w:val="center"/>
+          </w:tcPr>
+          <w:p>
+            <w:pPr>
+              <w:ind w:left="420"/>
+              <w:rPr>
+                <w:rFonts w:eastAsiaTheme="minorEastAsia"/>
+                <w:b/>
+                <w:bCs/>
+                <w:color w:val="ADADAD" w:themeColor="background2" w:themeShade="BF"/>
+                <w:u w:val="single"/>
+              </w:rPr>
+            </w:pPr>
+            <w:r>
+              <w:rPr>
+                <w:rFonts w:eastAsiaTheme="minorEastAsia"/>
+                <w:b/>
+                <w:bCs/>
+                <w:color w:val="ADADAD" w:themeColor="background2" w:themeShade="BF"/>
+                <w:u w:val="single"/>
+              </w:rPr>
+              <w:t>Solution2</w:t>
+            </w:r>
+          </w:p>
+          <w:p>
+            <w:pPr>
+              <w:ind w:left="420"/>
+              <w:rPr>
+                <w:rFonts w:eastAsiaTheme="minorEastAsia"/>
+                <w:color w:val="ADADAD" w:themeColor="background2" w:themeShade="BF"/>
+              </w:rPr>
+            </w:pPr>
+          </w:p>
+          <w:p>
+            <w:pPr>
+              <w:ind w:left="420"/>
+              <w:rPr>
+                <w:rFonts w:eastAsiaTheme="minorEastAsia"/>
+                <w:color w:val="ADADAD" w:themeColor="background2" w:themeShade="BF"/>
+              </w:rPr>
+            </w:pPr>
+            <m:oMathPara>
+              <m:oMathParaPr>
+                <m:jc m:val="left"/>
+              </m:oMathParaPr>
+              <m:oMath>
+                <m:r>
+                  <w:rPr>
+                    <w:rFonts w:ascii="Cambria Math" w:eastAsiaTheme="minorEastAsia" w:hAnsi="Cambria Math"/>
+                    <w:color w:val="ADADAD" w:themeColor="background2" w:themeShade="BF"/>
+                  </w:rPr>
+                  <m:t>l=0.338λ-0λ</m:t>
+                </m:r>
+              </m:oMath>
+            </m:oMathPara>
+          </w:p>
+          <w:p>
+            <w:pPr>
+              <w:ind w:left="420"/>
+              <w:rPr>
+                <w:rFonts w:eastAsiaTheme="minorEastAsia"/>
+                <w:color w:val="ADADAD" w:themeColor="background2" w:themeShade="BF"/>
+              </w:rPr>
+            </w:pPr>
+            <m:oMathPara>
+              <m:oMathParaPr>
+                <m:jc m:val="left"/>
+              </m:oMathParaPr>
+              <m:oMath>
+                <m:r>
+                  <w:rPr>
+                    <w:rFonts w:ascii="Cambria Math" w:eastAsiaTheme="minorEastAsia" w:hAnsi="Cambria Math"/>
+                    <w:color w:val="ADADAD" w:themeColor="background2" w:themeShade="BF"/>
+                  </w:rPr>
+                  <m:t>l=0.338λ+</m:t>
+                </m:r>
+                <m:f>
+                  <m:fPr>
+                    <m:ctrlPr>
+                      <w:rPr>
+                        <w:rFonts w:ascii="Cambria Math" w:eastAsiaTheme="minorEastAsia" w:hAnsi="Cambria Math"/>
+                        <w:i/>
+                        <w:color w:val="ADADAD" w:themeColor="background2" w:themeShade="BF"/>
+                      </w:rPr>
+                    </m:ctrlPr>
+                  </m:fPr>
+                  <m:num>
+                    <m:r>
+                      <w:rPr>
+                        <w:rFonts w:ascii="Cambria Math" w:eastAsiaTheme="minorEastAsia" w:hAnsi="Cambria Math"/>
+                        <w:color w:val="ADADAD" w:themeColor="background2" w:themeShade="BF"/>
+                      </w:rPr>
+                      <m:t>mλ</m:t>
+                    </m:r>
+                  </m:num>
+                  <m:den>
+                    <m:r>
+                      <w:rPr>
+                        <w:rFonts w:ascii="Cambria Math" w:eastAsiaTheme="minorEastAsia" w:hAnsi="Cambria Math"/>
+                        <w:color w:val="ADADAD" w:themeColor="background2" w:themeShade="BF"/>
+                      </w:rPr>
+                      <m:t>2</m:t>
+                    </m:r>
+                  </m:den>
+                </m:f>
+                <m:r>
+                  <w:rPr>
+                    <w:rFonts w:ascii="Cambria Math" w:eastAsiaTheme="minorEastAsia" w:hAnsi="Cambria Math"/>
+                    <w:color w:val="ADADAD" w:themeColor="background2" w:themeShade="BF"/>
+                  </w:rPr>
+                  <m:t>,m=0, 1, 2, …</m:t>
+                </m:r>
+              </m:oMath>
+            </m:oMathPara>
+          </w:p>
+          <w:p>
+            <w:pPr>
+              <w:ind w:left="420"/>
+              <w:rPr>
+                <w:rFonts w:eastAsiaTheme="minorEastAsia"/>
+                <w:color w:val="ADADAD" w:themeColor="background2" w:themeShade="BF"/>
+              </w:rPr>
+            </w:pPr>
+            <m:oMathPara>
+              <m:oMathParaPr>
+                <m:jc m:val="left"/>
+              </m:oMathParaPr>
+              <m:oMath>
+                <m:r>
+                  <w:rPr>
+                    <w:rFonts w:ascii="Cambria Math" w:eastAsiaTheme="minorEastAsia" w:hAnsi="Cambria Math"/>
+                    <w:color w:val="ADADAD" w:themeColor="background2" w:themeShade="BF"/>
+                  </w:rPr>
+                  <m:t>l=0.338λ=121.68°</m:t>
+                </m:r>
+              </m:oMath>
+            </m:oMathPara>
+          </w:p>
+          <w:p>
+            <w:pPr>
+              <w:ind w:left="420"/>
+              <w:rPr>
+                <w:rFonts w:eastAsiaTheme="minorEastAsia"/>
+                <w:color w:val="ADADAD" w:themeColor="background2" w:themeShade="BF"/>
+              </w:rPr>
+            </w:pPr>
+            <m:oMathPara>
+              <m:oMathParaPr>
+                <m:jc m:val="left"/>
+              </m:oMathParaPr>
+              <m:oMath>
+                <m:r>
+                  <w:rPr>
+                    <w:rFonts w:ascii="Cambria Math" w:eastAsiaTheme="minorEastAsia" w:hAnsi="Cambria Math"/>
+                    <w:color w:val="ADADAD" w:themeColor="background2" w:themeShade="BF"/>
+                  </w:rPr>
+                  <m:t>l=7.797mm</m:t>
+                </m:r>
+              </m:oMath>
+            </m:oMathPara>
+          </w:p>
+          <w:p>
+            <w:pPr>
+              <w:ind w:left="420"/>
+              <w:rPr>
+                <w:rFonts w:eastAsiaTheme="minorEastAsia"/>
+                <w:color w:val="ADADAD" w:themeColor="background2" w:themeShade="BF"/>
+              </w:rPr>
+            </w:pPr>
+          </w:p>
+          <w:p>
+            <w:pPr>
+              <w:ind w:left="420"/>
+              <w:rPr>
+                <w:rFonts w:eastAsiaTheme="minorEastAsia"/>
+                <w:color w:val="ADADAD" w:themeColor="background2" w:themeShade="BF"/>
+              </w:rPr>
+            </w:pPr>
+          </w:p>
+          <w:p>
+            <w:pPr>
+              <w:ind w:left="420"/>
+              <w:rPr>
+                <w:rFonts w:eastAsiaTheme="minorEastAsia"/>
+                <w:color w:val="ADADAD" w:themeColor="background2" w:themeShade="BF"/>
+              </w:rPr>
+            </w:pPr>
+            <m:oMathPara>
+              <m:oMathParaPr>
+                <m:jc m:val="left"/>
+              </m:oMathParaPr>
+              <m:oMath>
+                <m:r>
+                  <w:rPr>
+                    <w:rFonts w:ascii="Cambria Math" w:eastAsiaTheme="minorEastAsia" w:hAnsi="Cambria Math"/>
+                    <w:color w:val="ADADAD" w:themeColor="background2" w:themeShade="BF"/>
+                  </w:rPr>
+                  <m:t>d=0.054λ-0.321λ</m:t>
+                </m:r>
+              </m:oMath>
+            </m:oMathPara>
+          </w:p>
+          <w:p>
+            <w:pPr>
+              <w:ind w:left="420"/>
+              <w:rPr>
+                <w:rFonts w:eastAsiaTheme="minorEastAsia"/>
+                <w:color w:val="ADADAD" w:themeColor="background2" w:themeShade="BF"/>
+              </w:rPr>
+            </w:pPr>
+            <m:oMathPara>
+              <m:oMathParaPr>
+                <m:jc m:val="left"/>
+              </m:oMathParaPr>
+              <m:oMath>
+                <m:r>
+                  <w:rPr>
+                    <w:rFonts w:ascii="Cambria Math" w:eastAsiaTheme="minorEastAsia" w:hAnsi="Cambria Math"/>
+                    <w:color w:val="ADADAD" w:themeColor="background2" w:themeShade="BF"/>
+                  </w:rPr>
+                  <m:t>d=-0.267λ</m:t>
+                </m:r>
+              </m:oMath>
+            </m:oMathPara>
+          </w:p>
+          <w:p>
+            <w:pPr>
+              <w:ind w:left="420"/>
+              <w:rPr>
+                <w:rFonts w:eastAsiaTheme="minorEastAsia"/>
+                <w:color w:val="ADADAD" w:themeColor="background2" w:themeShade="BF"/>
+              </w:rPr>
+            </w:pPr>
+            <m:oMathPara>
+              <m:oMathParaPr>
+                <m:jc m:val="left"/>
+              </m:oMathParaPr>
+              <m:oMath>
+                <m:r>
+                  <w:rPr>
+                    <w:rFonts w:ascii="Cambria Math" w:eastAsiaTheme="minorEastAsia" w:hAnsi="Cambria Math"/>
+                    <w:color w:val="ADADAD" w:themeColor="background2" w:themeShade="BF"/>
+                  </w:rPr>
+                  <m:t>d=-0.267λ+0.5λ</m:t>
+                </m:r>
+              </m:oMath>
+            </m:oMathPara>
+          </w:p>
+          <w:p>
+            <w:pPr>
+              <w:ind w:left="420"/>
+              <w:rPr>
+                <w:rFonts w:eastAsiaTheme="minorEastAsia"/>
+                <w:color w:val="ADADAD" w:themeColor="background2" w:themeShade="BF"/>
+              </w:rPr>
+            </w:pPr>
+            <m:oMathPara>
+              <m:oMathParaPr>
+                <m:jc m:val="left"/>
+              </m:oMathParaPr>
+              <m:oMath>
+                <m:r>
+                  <w:rPr>
+                    <w:rFonts w:ascii="Cambria Math" w:eastAsiaTheme="minorEastAsia" w:hAnsi="Cambria Math"/>
+                    <w:color w:val="ADADAD" w:themeColor="background2" w:themeShade="BF"/>
+                  </w:rPr>
+                  <m:t>d=0.233λ</m:t>
+                </m:r>
+              </m:oMath>
+            </m:oMathPara>
+          </w:p>
+          <w:p>
+            <w:pPr>
+              <w:ind w:left="420"/>
+              <w:rPr>
+                <w:rFonts w:eastAsiaTheme="minorEastAsia"/>
+                <w:color w:val="ADADAD" w:themeColor="background2" w:themeShade="BF"/>
+              </w:rPr>
+            </w:pPr>
+            <m:oMathPara>
+              <m:oMathParaPr>
+                <m:jc m:val="left"/>
+              </m:oMathParaPr>
+              <m:oMath>
+                <m:r>
+                  <w:rPr>
+                    <w:rFonts w:ascii="Cambria Math" w:eastAsiaTheme="minorEastAsia" w:hAnsi="Cambria Math"/>
+                    <w:color w:val="ADADAD" w:themeColor="background2" w:themeShade="BF"/>
+                  </w:rPr>
+                  <m:t>d=0.233λ+</m:t>
+                </m:r>
+                <m:f>
+                  <m:fPr>
+                    <m:ctrlPr>
+                      <w:rPr>
+                        <w:rFonts w:ascii="Cambria Math" w:eastAsiaTheme="minorEastAsia" w:hAnsi="Cambria Math"/>
+                        <w:i/>
+                        <w:color w:val="ADADAD" w:themeColor="background2" w:themeShade="BF"/>
+                      </w:rPr>
+                    </m:ctrlPr>
+                  </m:fPr>
+                  <m:num>
+                    <m:r>
+                      <w:rPr>
+                        <w:rFonts w:ascii="Cambria Math" w:eastAsiaTheme="minorEastAsia" w:hAnsi="Cambria Math"/>
+                        <w:color w:val="ADADAD" w:themeColor="background2" w:themeShade="BF"/>
+                      </w:rPr>
+                      <m:t>mλ</m:t>
+                    </m:r>
+                  </m:num>
+                  <m:den>
+                    <m:r>
+                      <w:rPr>
+                        <w:rFonts w:ascii="Cambria Math" w:eastAsiaTheme="minorEastAsia" w:hAnsi="Cambria Math"/>
+                        <w:color w:val="ADADAD" w:themeColor="background2" w:themeShade="BF"/>
+                      </w:rPr>
+                      <m:t>2</m:t>
+                    </m:r>
+                  </m:den>
+                </m:f>
+                <m:r>
+                  <w:rPr>
+                    <w:rFonts w:ascii="Cambria Math" w:eastAsiaTheme="minorEastAsia" w:hAnsi="Cambria Math"/>
+                    <w:color w:val="ADADAD" w:themeColor="background2" w:themeShade="BF"/>
+                  </w:rPr>
+                  <m:t>, m=0, 1, 2, …</m:t>
+                </m:r>
+              </m:oMath>
+            </m:oMathPara>
+          </w:p>
+          <w:p>
+            <w:pPr>
+              <w:ind w:left="420"/>
+              <w:rPr>
+                <w:rFonts w:eastAsiaTheme="minorEastAsia"/>
+                <w:color w:val="ADADAD" w:themeColor="background2" w:themeShade="BF"/>
+              </w:rPr>
+            </w:pPr>
+            <m:oMathPara>
+              <m:oMathParaPr>
+                <m:jc m:val="left"/>
+              </m:oMathParaPr>
+              <m:oMath>
+                <m:r>
+                  <w:rPr>
+                    <w:rFonts w:ascii="Cambria Math" w:eastAsiaTheme="minorEastAsia" w:hAnsi="Cambria Math"/>
+                    <w:color w:val="ADADAD" w:themeColor="background2" w:themeShade="BF"/>
+                  </w:rPr>
+                  <m:t>d=0.233λ=83.88°</m:t>
+                </m:r>
+              </m:oMath>
+            </m:oMathPara>
+          </w:p>
+          <w:p>
+            <w:pPr>
+              <w:ind w:left="420"/>
+              <w:rPr>
+                <w:rFonts w:eastAsiaTheme="minorEastAsia"/>
+                <w:color w:val="ADADAD" w:themeColor="background2" w:themeShade="BF"/>
+              </w:rPr>
+            </w:pPr>
+            <m:oMathPara>
+              <m:oMathParaPr>
+                <m:jc m:val="left"/>
+              </m:oMathParaPr>
+              <m:oMath>
+                <m:r>
+                  <w:rPr>
+                    <w:rFonts w:ascii="Cambria Math" w:eastAsiaTheme="minorEastAsia" w:hAnsi="Cambria Math"/>
+                    <w:color w:val="ADADAD" w:themeColor="background2" w:themeShade="BF"/>
+                  </w:rPr>
+                  <m:t>d=5.375mm</m:t>
+                </m:r>
+              </m:oMath>
+            </m:oMathPara>
+          </w:p>
+        </w:tc>
+      </w:tr>
+    </w:tbl>
+    <w:p/>
+    <w:tbl>
+      <w:tblPr>
+        <w:tblStyle w:val="TableGrid"/>
+        <w:tblW w:w="0" w:type="auto"/>
+        <w:tblBorders>
+          <w:top w:val="none" w:sz="0" w:space="0" w:color="auto"/>
+          <w:left w:val="none" w:sz="0" w:space="0" w:color="auto"/>
+          <w:bottom w:val="none" w:sz="0" w:space="0" w:color="auto"/>
+          <w:right w:val="none" w:sz="0" w:space="0" w:color="auto"/>
+          <w:insideH w:val="none" w:sz="0" w:space="0" w:color="auto"/>
+          <w:insideV w:val="none" w:sz="0" w:space="0" w:color="auto"/>
+        </w:tblBorders>
+        <w:tblCellMar>
+          <w:left w:w="0" w:type="dxa"/>
+          <w:right w:w="0" w:type="dxa"/>
+        </w:tblCellMar>
+        <w:tblLook w:val="04A0" w:firstRow="1" w:lastRow="0" w:firstColumn="1" w:lastColumn="0" w:noHBand="0" w:noVBand="1"/>
+      </w:tblPr>
+      <w:tblGrid>
+        <w:gridCol w:w="5472"/>
+        <w:gridCol w:w="3888"/>
+      </w:tblGrid>
+      <w:tr>
+        <w:tc>
+          <w:tcPr>
+            <w:tcW w:w="4675" w:type="dxa"/>
+          </w:tcPr>
+          <w:p>
+            <w:pPr>
+              <w:rPr>
+                <w:rFonts w:eastAsiaTheme="minorEastAsia"/>
+              </w:rPr>
+            </w:pPr>
+            <w:r>
+              <w:rPr>
+                <w:rFonts w:eastAsiaTheme="minorEastAsia"/>
+                <w:noProof/>
+              </w:rPr>
+              <w:lastRenderedPageBreak/>
+              <w:drawing>
+                <wp:inline distT="0" distB="0" distL="0" distR="0" wp14:anchorId="2E2A7DAC" wp14:editId="294026FD">
+                  <wp:extent cx="3474720" cy="3844371"/>
+                  <wp:effectExtent l="0" t="0" r="0" b="3810"/>
+                  <wp:docPr id="1521442351" name="Picture 6"/>
+                  <wp:cNvGraphicFramePr>
+                    <a:graphicFrameLocks xmlns:a="http://schemas.openxmlformats.org/drawingml/2006/main" noChangeAspect="1"/>
+                  </wp:cNvGraphicFramePr>
+                  <a:graphic xmlns:a="http://schemas.openxmlformats.org/drawingml/2006/main">
+                    <a:graphicData uri="http://schemas.openxmlformats.org/drawingml/2006/picture">
+                      <pic:pic xmlns:pic="http://schemas.openxmlformats.org/drawingml/2006/picture">
+                        <pic:nvPicPr>
+                          <pic:cNvPr id="1521442351" name="Picture 6"/>
+                          <pic:cNvPicPr/>
+                        </pic:nvPicPr>
+                        <pic:blipFill>
+                          <a:blip r:embed="rId13" cstate="print">
+                            <a:extLst>
+                              <a:ext uri="{28A0092B-C50C-407E-A947-70E740481C1C}">
+                                <a14:useLocalDpi xmlns:a14="http://schemas.microsoft.com/office/drawing/2010/main" val="0"/>
+                              </a:ext>
+                            </a:extLst>
+                          </a:blip>
+                          <a:srcRect l="1370" r="1370"/>
+                          <a:stretch>
+                            <a:fillRect/>
+                          </a:stretch>
+                        </pic:blipFill>
+                        <pic:spPr bwMode="auto">
+                          <a:xfrm>
+                            <a:off x="0" y="0"/>
+                            <a:ext cx="3474720" cy="3844371"/>
+                          </a:xfrm>
+                          <a:prstGeom prst="rect">
+                            <a:avLst/>
+                          </a:prstGeom>
+                          <a:ln>
+                            <a:noFill/>
+                          </a:ln>
+                          <a:extLst>
+                            <a:ext uri="{53640926-AAD7-44D8-BBD7-CCE9431645EC}">
+                              <a14:shadowObscured xmlns:a14="http://schemas.microsoft.com/office/drawing/2010/main"/>
+                            </a:ext>
+                          </a:extLst>
+                        </pic:spPr>
+                      </pic:pic>
+                    </a:graphicData>
+                  </a:graphic>
+                </wp:inline>
+              </w:drawing>
+            </w:r>
+          </w:p>
+        </w:tc>
+        <w:tc>
+          <w:tcPr>
+            <w:tcW w:w="4675" w:type="dxa"/>
+            <w:vAlign w:val="center"/>
+          </w:tcPr>
+          <w:p>
+            <w:pPr>
+              <w:ind w:left="420"/>
+              <w:jc w:val="both"/>
+              <w:rPr>
+                <w:rFonts w:eastAsiaTheme="minorEastAsia"/>
+                <w:b/>
+                <w:bCs/>
+                <w:u w:val="single"/>
+              </w:rPr>
+            </w:pPr>
+            <w:r>
+              <w:rPr>
+                <w:rFonts w:eastAsiaTheme="minorEastAsia"/>
+                <w:b/>
+                <w:bCs/>
+                <w:u w:val="single"/>
+              </w:rPr>
+              <w:t>Solution1</w:t>
+            </w:r>
+          </w:p>
+          <w:p>
+            <w:pPr>
+              <w:ind w:left="420"/>
+              <w:jc w:val="both"/>
+              <w:rPr>
+                <w:rFonts w:eastAsiaTheme="minorEastAsia"/>
+              </w:rPr>
+            </w:pPr>
+          </w:p>
+          <w:p>
+            <w:pPr>
+              <w:ind w:left="420"/>
+              <w:jc w:val="both"/>
+              <w:rPr>
+                <w:rFonts w:eastAsiaTheme="minorEastAsia"/>
+              </w:rPr>
+            </w:pPr>
+            <m:oMathPara>
+              <m:oMathParaPr>
+                <m:jc m:val="left"/>
+              </m:oMathParaPr>
+              <m:oMath>
+                <m:r>
+                  <w:rPr>
+                    <w:rFonts w:ascii="Cambria Math" w:eastAsiaTheme="minorEastAsia" w:hAnsi="Cambria Math"/>
+                  </w:rPr>
+                  <m:t>l=0.058λ-0λ</m:t>
+                </m:r>
+              </m:oMath>
+            </m:oMathPara>
+          </w:p>
+          <w:p>
+            <w:pPr>
+              <w:ind w:left="420"/>
+              <w:jc w:val="both"/>
+              <w:rPr>
+                <w:rFonts w:eastAsiaTheme="minorEastAsia"/>
+              </w:rPr>
+            </w:pPr>
+            <m:oMathPara>
+              <m:oMathParaPr>
+                <m:jc m:val="left"/>
+              </m:oMathParaPr>
+              <m:oMath>
+                <m:r>
+                  <w:rPr>
+                    <w:rFonts w:ascii="Cambria Math" w:eastAsiaTheme="minorEastAsia" w:hAnsi="Cambria Math"/>
+                  </w:rPr>
+                  <m:t>l=0.058λ+</m:t>
+                </m:r>
+                <m:f>
+                  <m:fPr>
+                    <m:ctrlPr>
+                      <w:rPr>
+                        <w:rFonts w:ascii="Cambria Math" w:eastAsiaTheme="minorEastAsia" w:hAnsi="Cambria Math"/>
+                        <w:i/>
+                      </w:rPr>
+                    </m:ctrlPr>
+                  </m:fPr>
+                  <m:num>
+                    <m:r>
+                      <w:rPr>
+                        <w:rFonts w:ascii="Cambria Math" w:eastAsiaTheme="minorEastAsia" w:hAnsi="Cambria Math"/>
+                      </w:rPr>
+                      <m:t>mλ</m:t>
+                    </m:r>
+                  </m:num>
+                  <m:den>
+                    <m:r>
+                      <w:rPr>
+                        <w:rFonts w:ascii="Cambria Math" w:eastAsiaTheme="minorEastAsia" w:hAnsi="Cambria Math"/>
+                      </w:rPr>
+                      <m:t>2</m:t>
+                    </m:r>
+                  </m:den>
+                </m:f>
+                <m:r>
+                  <w:rPr>
+                    <w:rFonts w:ascii="Cambria Math" w:eastAsiaTheme="minorEastAsia" w:hAnsi="Cambria Math"/>
+                  </w:rPr>
+                  <m:t>, m=0</m:t>
+                </m:r>
+                <m:r>
+                  <w:rPr>
+                    <w:rFonts w:ascii="Cambria Math" w:eastAsiaTheme="minorEastAsia" w:hAnsi="Cambria Math"/>
+                    <w:color w:val="ADADAD" w:themeColor="background2" w:themeShade="BF"/>
+                  </w:rPr>
+                  <m:t>, 1, 2, …</m:t>
+                </m:r>
+              </m:oMath>
+            </m:oMathPara>
+          </w:p>
+          <w:p>
+            <w:pPr>
+              <w:ind w:left="420"/>
+              <w:jc w:val="both"/>
+              <w:rPr>
+                <w:rFonts w:eastAsiaTheme="minorEastAsia"/>
+              </w:rPr>
+            </w:pPr>
+            <m:oMathPara>
+              <m:oMathParaPr>
+                <m:jc m:val="left"/>
+              </m:oMathParaPr>
+              <m:oMath>
+                <m:r>
+                  <w:rPr>
+                    <w:rFonts w:ascii="Cambria Math" w:eastAsiaTheme="minorEastAsia" w:hAnsi="Cambria Math"/>
+                  </w:rPr>
+                  <m:t>l=0.058λ=20.88°</m:t>
+                </m:r>
+              </m:oMath>
+            </m:oMathPara>
+          </w:p>
+          <w:p>
+            <w:pPr>
+              <w:ind w:left="420"/>
+              <w:jc w:val="both"/>
+              <w:rPr>
+                <w:rFonts w:eastAsiaTheme="minorEastAsia"/>
+              </w:rPr>
+            </w:pPr>
+            <m:oMathPara>
+              <m:oMathParaPr>
+                <m:jc m:val="left"/>
+              </m:oMathParaPr>
+              <m:oMath>
+                <m:r>
+                  <w:rPr>
+                    <w:rFonts w:ascii="Cambria Math" w:eastAsiaTheme="minorEastAsia" w:hAnsi="Cambria Math"/>
+                    <w:color w:val="0070C0"/>
+                  </w:rPr>
+                  <m:t>l=1.338mm</m:t>
+                </m:r>
+              </m:oMath>
+            </m:oMathPara>
+          </w:p>
+          <w:p>
+            <w:pPr>
+              <w:ind w:left="420"/>
+              <w:jc w:val="both"/>
+              <w:rPr>
+                <w:rFonts w:eastAsiaTheme="minorEastAsia"/>
+              </w:rPr>
+            </w:pPr>
+          </w:p>
+          <w:p>
+            <w:pPr>
+              <w:ind w:left="420"/>
+              <w:jc w:val="both"/>
+              <w:rPr>
+                <w:rFonts w:eastAsiaTheme="minorEastAsia"/>
+              </w:rPr>
+            </w:pPr>
+          </w:p>
+          <w:p>
+            <w:pPr>
+              <w:ind w:left="420"/>
+              <w:jc w:val="both"/>
+              <w:rPr>
+                <w:rFonts w:eastAsiaTheme="minorEastAsia"/>
+              </w:rPr>
+            </w:pPr>
+            <m:oMathPara>
+              <m:oMathParaPr>
+                <m:jc m:val="left"/>
+              </m:oMathParaPr>
+              <m:oMath>
+                <m:r>
+                  <w:rPr>
+                    <w:rFonts w:ascii="Cambria Math" w:eastAsiaTheme="minorEastAsia" w:hAnsi="Cambria Math"/>
+                  </w:rPr>
+                  <m:t>d=0.164λ-0.14λ</m:t>
+                </m:r>
+              </m:oMath>
+            </m:oMathPara>
+          </w:p>
+          <w:p>
+            <w:pPr>
+              <w:ind w:left="420"/>
+              <w:jc w:val="both"/>
+              <w:rPr>
+                <w:rFonts w:eastAsiaTheme="minorEastAsia"/>
+              </w:rPr>
+            </w:pPr>
+            <m:oMathPara>
+              <m:oMathParaPr>
+                <m:jc m:val="left"/>
+              </m:oMathParaPr>
+              <m:oMath>
+                <m:r>
+                  <w:rPr>
+                    <w:rFonts w:ascii="Cambria Math" w:eastAsiaTheme="minorEastAsia" w:hAnsi="Cambria Math"/>
+                  </w:rPr>
+                  <m:t>d=0.024λ+</m:t>
+                </m:r>
+                <m:f>
+                  <m:fPr>
+                    <m:ctrlPr>
+                      <w:rPr>
+                        <w:rFonts w:ascii="Cambria Math" w:eastAsiaTheme="minorEastAsia" w:hAnsi="Cambria Math"/>
+                        <w:i/>
+                      </w:rPr>
+                    </m:ctrlPr>
+                  </m:fPr>
+                  <m:num>
+                    <m:r>
+                      <w:rPr>
+                        <w:rFonts w:ascii="Cambria Math" w:eastAsiaTheme="minorEastAsia" w:hAnsi="Cambria Math"/>
+                      </w:rPr>
+                      <m:t>mλ</m:t>
+                    </m:r>
+                  </m:num>
+                  <m:den>
+                    <m:r>
+                      <w:rPr>
+                        <w:rFonts w:ascii="Cambria Math" w:eastAsiaTheme="minorEastAsia" w:hAnsi="Cambria Math"/>
+                      </w:rPr>
+                      <m:t>2</m:t>
+                    </m:r>
+                  </m:den>
+                </m:f>
+                <m:r>
+                  <w:rPr>
+                    <w:rFonts w:ascii="Cambria Math" w:eastAsiaTheme="minorEastAsia" w:hAnsi="Cambria Math"/>
+                  </w:rPr>
+                  <m:t>, m=0</m:t>
+                </m:r>
+                <m:r>
+                  <w:rPr>
+                    <w:rFonts w:ascii="Cambria Math" w:eastAsiaTheme="minorEastAsia" w:hAnsi="Cambria Math"/>
+                    <w:color w:val="ADADAD" w:themeColor="background2" w:themeShade="BF"/>
+                  </w:rPr>
+                  <m:t>, 1, 2, …</m:t>
+                </m:r>
+              </m:oMath>
+            </m:oMathPara>
+          </w:p>
+          <w:p>
+            <w:pPr>
+              <w:ind w:left="420"/>
+              <w:jc w:val="both"/>
+              <w:rPr>
+                <w:rFonts w:eastAsiaTheme="minorEastAsia"/>
+              </w:rPr>
+            </w:pPr>
+            <m:oMathPara>
+              <m:oMathParaPr>
+                <m:jc m:val="left"/>
+              </m:oMathParaPr>
+              <m:oMath>
+                <m:r>
+                  <w:rPr>
+                    <w:rFonts w:ascii="Cambria Math" w:eastAsiaTheme="minorEastAsia" w:hAnsi="Cambria Math"/>
+                  </w:rPr>
+                  <m:t>d=0.024λ=8.64°</m:t>
+                </m:r>
+              </m:oMath>
+            </m:oMathPara>
+          </w:p>
+          <w:p>
+            <w:pPr>
+              <w:ind w:left="420"/>
+              <w:jc w:val="both"/>
+              <w:rPr>
+                <w:rFonts w:eastAsiaTheme="minorEastAsia"/>
+              </w:rPr>
+            </w:pPr>
+            <m:oMathPara>
+              <m:oMathParaPr>
+                <m:jc m:val="left"/>
+              </m:oMathParaPr>
+              <m:oMath>
+                <m:r>
+                  <w:rPr>
+                    <w:rFonts w:ascii="Cambria Math" w:eastAsiaTheme="minorEastAsia" w:hAnsi="Cambria Math"/>
+                    <w:color w:val="0070C0"/>
+                  </w:rPr>
+                  <m:t>d=0.554mm</m:t>
+                </m:r>
+              </m:oMath>
+            </m:oMathPara>
+          </w:p>
+        </w:tc>
+      </w:tr>
+      <w:tr>
+        <w:tc>
+          <w:tcPr>
+            <w:tcW w:w="4675" w:type="dxa"/>
+          </w:tcPr>
+          <w:p>
+            <w:pPr>
+              <w:rPr>
+                <w:rFonts w:eastAsiaTheme="minorEastAsia"/>
+              </w:rPr>
+            </w:pPr>
+            <w:r>
+              <w:rPr>
+                <w:rFonts w:eastAsiaTheme="minorEastAsia"/>
+                <w:noProof/>
+              </w:rPr>
+              <w:drawing>
+                <wp:inline distT="0" distB="0" distL="0" distR="0" wp14:anchorId="129268D5" wp14:editId="0F4A1CD1">
+                  <wp:extent cx="3474720" cy="3737286"/>
+                  <wp:effectExtent l="0" t="0" r="0" b="0"/>
+                  <wp:docPr id="1802774194" name="Picture 7"/>
+                  <wp:cNvGraphicFramePr>
+                    <a:graphicFrameLocks xmlns:a="http://schemas.openxmlformats.org/drawingml/2006/main" noChangeAspect="1"/>
+                  </wp:cNvGraphicFramePr>
+                  <a:graphic xmlns:a="http://schemas.openxmlformats.org/drawingml/2006/main">
+                    <a:graphicData uri="http://schemas.openxmlformats.org/drawingml/2006/picture">
+                      <pic:pic xmlns:pic="http://schemas.openxmlformats.org/drawingml/2006/picture">
+                        <pic:nvPicPr>
+                          <pic:cNvPr id="1802774194" name="Picture 7"/>
+                          <pic:cNvPicPr/>
+                        </pic:nvPicPr>
+                        <pic:blipFill>
+                          <a:blip r:embed="rId14" cstate="print">
+                            <a:alphaModFix amt="50000"/>
+                            <a:extLst>
+                              <a:ext uri="{28A0092B-C50C-407E-A947-70E740481C1C}">
+                                <a14:useLocalDpi xmlns:a14="http://schemas.microsoft.com/office/drawing/2010/main" val="0"/>
+                              </a:ext>
+                            </a:extLst>
+                          </a:blip>
+                          <a:srcRect l="598" r="598"/>
+                          <a:stretch>
+                            <a:fillRect/>
+                          </a:stretch>
+                        </pic:blipFill>
+                        <pic:spPr bwMode="auto">
+                          <a:xfrm>
+                            <a:off x="0" y="0"/>
+                            <a:ext cx="3474720" cy="3737286"/>
+                          </a:xfrm>
+                          <a:prstGeom prst="rect">
+                            <a:avLst/>
+                          </a:prstGeom>
+                          <a:ln>
+                            <a:noFill/>
+                          </a:ln>
+                          <a:extLst>
+                            <a:ext uri="{53640926-AAD7-44D8-BBD7-CCE9431645EC}">
+                              <a14:shadowObscured xmlns:a14="http://schemas.microsoft.com/office/drawing/2010/main"/>
+                            </a:ext>
+                          </a:extLst>
+                        </pic:spPr>
+                      </pic:pic>
+                    </a:graphicData>
+                  </a:graphic>
+                </wp:inline>
+              </w:drawing>
+            </w:r>
+          </w:p>
+        </w:tc>
+        <w:tc>
+          <w:tcPr>
+            <w:tcW w:w="4675" w:type="dxa"/>
+            <w:vAlign w:val="center"/>
+          </w:tcPr>
+          <w:p>
+            <w:pPr>
+              <w:ind w:left="420"/>
+              <w:rPr>
+                <w:rFonts w:eastAsiaTheme="minorEastAsia"/>
+                <w:b/>
+                <w:bCs/>
+                <w:color w:val="ADADAD" w:themeColor="background2" w:themeShade="BF"/>
+                <w:u w:val="single"/>
+              </w:rPr>
+            </w:pPr>
+            <w:r>
+              <w:rPr>
+                <w:rFonts w:eastAsiaTheme="minorEastAsia"/>
+                <w:b/>
+                <w:bCs/>
+                <w:color w:val="ADADAD" w:themeColor="background2" w:themeShade="BF"/>
+                <w:u w:val="single"/>
+              </w:rPr>
+              <w:t>Solution2</w:t>
+            </w:r>
+          </w:p>
+          <w:p>
+            <w:pPr>
+              <w:ind w:left="420"/>
+              <w:rPr>
+                <w:rFonts w:eastAsiaTheme="minorEastAsia"/>
+                <w:color w:val="ADADAD" w:themeColor="background2" w:themeShade="BF"/>
+              </w:rPr>
+            </w:pPr>
+          </w:p>
+          <w:p>
+            <w:pPr>
+              <w:ind w:left="420"/>
+              <w:rPr>
+                <w:rFonts w:eastAsiaTheme="minorEastAsia"/>
+                <w:color w:val="ADADAD" w:themeColor="background2" w:themeShade="BF"/>
+              </w:rPr>
+            </w:pPr>
+            <m:oMathPara>
+              <m:oMathParaPr>
+                <m:jc m:val="left"/>
+              </m:oMathParaPr>
+              <m:oMath>
+                <m:r>
+                  <w:rPr>
+                    <w:rFonts w:ascii="Cambria Math" w:eastAsiaTheme="minorEastAsia" w:hAnsi="Cambria Math"/>
+                    <w:color w:val="ADADAD" w:themeColor="background2" w:themeShade="BF"/>
+                  </w:rPr>
+                  <m:t>l=0.442λ-0λ</m:t>
+                </m:r>
+              </m:oMath>
+            </m:oMathPara>
+          </w:p>
+          <w:p>
+            <w:pPr>
+              <w:ind w:left="420"/>
+              <w:rPr>
+                <w:rFonts w:eastAsiaTheme="minorEastAsia"/>
+                <w:color w:val="ADADAD" w:themeColor="background2" w:themeShade="BF"/>
+              </w:rPr>
+            </w:pPr>
+            <m:oMathPara>
+              <m:oMathParaPr>
+                <m:jc m:val="left"/>
+              </m:oMathParaPr>
+              <m:oMath>
+                <m:r>
+                  <w:rPr>
+                    <w:rFonts w:ascii="Cambria Math" w:eastAsiaTheme="minorEastAsia" w:hAnsi="Cambria Math"/>
+                    <w:color w:val="ADADAD" w:themeColor="background2" w:themeShade="BF"/>
+                  </w:rPr>
+                  <m:t>l=0.442λ+</m:t>
+                </m:r>
+                <m:f>
+                  <m:fPr>
+                    <m:ctrlPr>
+                      <w:rPr>
+                        <w:rFonts w:ascii="Cambria Math" w:eastAsiaTheme="minorEastAsia" w:hAnsi="Cambria Math"/>
+                        <w:i/>
+                        <w:color w:val="ADADAD" w:themeColor="background2" w:themeShade="BF"/>
+                      </w:rPr>
+                    </m:ctrlPr>
+                  </m:fPr>
+                  <m:num>
+                    <m:r>
+                      <w:rPr>
+                        <w:rFonts w:ascii="Cambria Math" w:eastAsiaTheme="minorEastAsia" w:hAnsi="Cambria Math"/>
+                        <w:color w:val="ADADAD" w:themeColor="background2" w:themeShade="BF"/>
+                      </w:rPr>
+                      <m:t>mλ</m:t>
+                    </m:r>
+                  </m:num>
+                  <m:den>
+                    <m:r>
+                      <w:rPr>
+                        <w:rFonts w:ascii="Cambria Math" w:eastAsiaTheme="minorEastAsia" w:hAnsi="Cambria Math"/>
+                        <w:color w:val="ADADAD" w:themeColor="background2" w:themeShade="BF"/>
+                      </w:rPr>
+                      <m:t>2</m:t>
+                    </m:r>
+                  </m:den>
+                </m:f>
+                <m:r>
+                  <w:rPr>
+                    <w:rFonts w:ascii="Cambria Math" w:eastAsiaTheme="minorEastAsia" w:hAnsi="Cambria Math"/>
+                    <w:color w:val="ADADAD" w:themeColor="background2" w:themeShade="BF"/>
+                  </w:rPr>
+                  <m:t>, m=0, 1, 2, …</m:t>
+                </m:r>
+              </m:oMath>
+            </m:oMathPara>
+          </w:p>
+          <w:p>
+            <w:pPr>
+              <w:ind w:left="420"/>
+              <w:rPr>
+                <w:rFonts w:eastAsiaTheme="minorEastAsia"/>
+                <w:color w:val="ADADAD" w:themeColor="background2" w:themeShade="BF"/>
+              </w:rPr>
+            </w:pPr>
+            <m:oMathPara>
+              <m:oMathParaPr>
+                <m:jc m:val="left"/>
+              </m:oMathParaPr>
+              <m:oMath>
+                <m:r>
+                  <w:rPr>
+                    <w:rFonts w:ascii="Cambria Math" w:eastAsiaTheme="minorEastAsia" w:hAnsi="Cambria Math"/>
+                    <w:color w:val="ADADAD" w:themeColor="background2" w:themeShade="BF"/>
+                  </w:rPr>
+                  <m:t>l=0.442λ=159.12°</m:t>
+                </m:r>
+              </m:oMath>
+            </m:oMathPara>
+          </w:p>
+          <w:p>
+            <w:pPr>
+              <w:ind w:left="420"/>
+              <w:rPr>
+                <w:rFonts w:eastAsiaTheme="minorEastAsia"/>
+                <w:color w:val="ADADAD" w:themeColor="background2" w:themeShade="BF"/>
+              </w:rPr>
+            </w:pPr>
+            <m:oMathPara>
+              <m:oMathParaPr>
+                <m:jc m:val="left"/>
+              </m:oMathParaPr>
+              <m:oMath>
+                <m:r>
+                  <w:rPr>
+                    <w:rFonts w:ascii="Cambria Math" w:eastAsiaTheme="minorEastAsia" w:hAnsi="Cambria Math"/>
+                    <w:color w:val="ADADAD" w:themeColor="background2" w:themeShade="BF"/>
+                  </w:rPr>
+                  <m:t>l=10.197mm</m:t>
+                </m:r>
+              </m:oMath>
+            </m:oMathPara>
+          </w:p>
+          <w:p>
+            <w:pPr>
+              <w:ind w:left="420"/>
+              <w:rPr>
+                <w:rFonts w:eastAsiaTheme="minorEastAsia"/>
+                <w:color w:val="ADADAD" w:themeColor="background2" w:themeShade="BF"/>
+              </w:rPr>
+            </w:pPr>
+          </w:p>
+          <w:p>
+            <w:pPr>
+              <w:ind w:left="420"/>
+              <w:rPr>
+                <w:rFonts w:eastAsiaTheme="minorEastAsia"/>
+                <w:color w:val="ADADAD" w:themeColor="background2" w:themeShade="BF"/>
+              </w:rPr>
+            </w:pPr>
+          </w:p>
+          <w:p>
+            <w:pPr>
+              <w:ind w:left="420"/>
+              <w:rPr>
+                <w:rFonts w:eastAsiaTheme="minorEastAsia"/>
+                <w:color w:val="ADADAD" w:themeColor="background2" w:themeShade="BF"/>
+              </w:rPr>
+            </w:pPr>
+            <m:oMathPara>
+              <m:oMathParaPr>
+                <m:jc m:val="left"/>
+              </m:oMathParaPr>
+              <m:oMath>
+                <m:r>
+                  <w:rPr>
+                    <w:rFonts w:ascii="Cambria Math" w:eastAsiaTheme="minorEastAsia" w:hAnsi="Cambria Math"/>
+                    <w:color w:val="ADADAD" w:themeColor="background2" w:themeShade="BF"/>
+                  </w:rPr>
+                  <m:t>d=0.164λ-0.36λ</m:t>
+                </m:r>
+              </m:oMath>
+            </m:oMathPara>
+          </w:p>
+          <w:p>
+            <w:pPr>
+              <w:ind w:left="420"/>
+              <w:rPr>
+                <w:rFonts w:eastAsiaTheme="minorEastAsia"/>
+                <w:color w:val="ADADAD" w:themeColor="background2" w:themeShade="BF"/>
+              </w:rPr>
+            </w:pPr>
+            <m:oMathPara>
+              <m:oMathParaPr>
+                <m:jc m:val="left"/>
+              </m:oMathParaPr>
+              <m:oMath>
+                <m:r>
+                  <w:rPr>
+                    <w:rFonts w:ascii="Cambria Math" w:eastAsiaTheme="minorEastAsia" w:hAnsi="Cambria Math"/>
+                    <w:color w:val="ADADAD" w:themeColor="background2" w:themeShade="BF"/>
+                  </w:rPr>
+                  <m:t>d=-0.196λ</m:t>
+                </m:r>
+              </m:oMath>
+            </m:oMathPara>
+          </w:p>
+          <w:p>
+            <w:pPr>
+              <w:ind w:left="420"/>
+              <w:rPr>
+                <w:rFonts w:eastAsiaTheme="minorEastAsia"/>
+                <w:color w:val="ADADAD" w:themeColor="background2" w:themeShade="BF"/>
+              </w:rPr>
+            </w:pPr>
+            <m:oMathPara>
+              <m:oMathParaPr>
+                <m:jc m:val="left"/>
+              </m:oMathParaPr>
+              <m:oMath>
+                <m:r>
+                  <w:rPr>
+                    <w:rFonts w:ascii="Cambria Math" w:eastAsiaTheme="minorEastAsia" w:hAnsi="Cambria Math"/>
+                    <w:color w:val="ADADAD" w:themeColor="background2" w:themeShade="BF"/>
+                  </w:rPr>
+                  <m:t>d=-0.196λ+0.5λ</m:t>
+                </m:r>
+              </m:oMath>
+            </m:oMathPara>
+          </w:p>
+          <w:p>
+            <w:pPr>
+              <w:ind w:left="420"/>
+              <w:rPr>
+                <w:rFonts w:eastAsiaTheme="minorEastAsia"/>
+                <w:color w:val="ADADAD" w:themeColor="background2" w:themeShade="BF"/>
+              </w:rPr>
+            </w:pPr>
+            <m:oMathPara>
+              <m:oMathParaPr>
+                <m:jc m:val="left"/>
+              </m:oMathParaPr>
+              <m:oMath>
+                <m:r>
+                  <w:rPr>
+                    <w:rFonts w:ascii="Cambria Math" w:eastAsiaTheme="minorEastAsia" w:hAnsi="Cambria Math"/>
+                    <w:color w:val="ADADAD" w:themeColor="background2" w:themeShade="BF"/>
+                  </w:rPr>
+                  <m:t>d=0.304λ+</m:t>
+                </m:r>
+                <m:f>
+                  <m:fPr>
+                    <m:ctrlPr>
+                      <w:rPr>
+                        <w:rFonts w:ascii="Cambria Math" w:eastAsiaTheme="minorEastAsia" w:hAnsi="Cambria Math"/>
+                        <w:i/>
+                        <w:color w:val="ADADAD" w:themeColor="background2" w:themeShade="BF"/>
+                      </w:rPr>
+                    </m:ctrlPr>
+                  </m:fPr>
+                  <m:num>
+                    <m:r>
+                      <w:rPr>
+                        <w:rFonts w:ascii="Cambria Math" w:eastAsiaTheme="minorEastAsia" w:hAnsi="Cambria Math"/>
+                        <w:color w:val="ADADAD" w:themeColor="background2" w:themeShade="BF"/>
+                      </w:rPr>
+                      <m:t>mλ</m:t>
+                    </m:r>
+                  </m:num>
+                  <m:den>
+                    <m:r>
+                      <w:rPr>
+                        <w:rFonts w:ascii="Cambria Math" w:eastAsiaTheme="minorEastAsia" w:hAnsi="Cambria Math"/>
+                        <w:color w:val="ADADAD" w:themeColor="background2" w:themeShade="BF"/>
+                      </w:rPr>
+                      <m:t>2</m:t>
+                    </m:r>
+                  </m:den>
+                </m:f>
+                <m:r>
+                  <w:rPr>
+                    <w:rFonts w:ascii="Cambria Math" w:eastAsiaTheme="minorEastAsia" w:hAnsi="Cambria Math"/>
+                    <w:color w:val="ADADAD" w:themeColor="background2" w:themeShade="BF"/>
+                  </w:rPr>
+                  <m:t>, m=0, 1, 2, …</m:t>
+                </m:r>
+              </m:oMath>
+            </m:oMathPara>
+          </w:p>
+          <w:p>
+            <w:pPr>
+              <w:ind w:left="420"/>
+              <w:rPr>
+                <w:rFonts w:eastAsiaTheme="minorEastAsia"/>
+                <w:color w:val="ADADAD" w:themeColor="background2" w:themeShade="BF"/>
+              </w:rPr>
+            </w:pPr>
+            <m:oMathPara>
+              <m:oMathParaPr>
+                <m:jc m:val="left"/>
+              </m:oMathParaPr>
+              <m:oMath>
+                <m:r>
+                  <w:rPr>
+                    <w:rFonts w:ascii="Cambria Math" w:eastAsiaTheme="minorEastAsia" w:hAnsi="Cambria Math"/>
+                    <w:color w:val="ADADAD" w:themeColor="background2" w:themeShade="BF"/>
+                  </w:rPr>
+                  <m:t>d=0.304λ=109.44°</m:t>
+                </m:r>
+              </m:oMath>
+            </m:oMathPara>
+          </w:p>
+          <w:p>
+            <w:pPr>
+              <w:ind w:left="420"/>
+              <w:rPr>
+                <w:rFonts w:eastAsiaTheme="minorEastAsia"/>
+                <w:color w:val="ADADAD" w:themeColor="background2" w:themeShade="BF"/>
+              </w:rPr>
+            </w:pPr>
+            <m:oMathPara>
+              <m:oMathParaPr>
+                <m:jc m:val="left"/>
+              </m:oMathParaPr>
+              <m:oMath>
+                <m:r>
+                  <w:rPr>
+                    <w:rFonts w:ascii="Cambria Math" w:eastAsiaTheme="minorEastAsia" w:hAnsi="Cambria Math"/>
+                    <w:color w:val="ADADAD" w:themeColor="background2" w:themeShade="BF"/>
+                  </w:rPr>
+                  <m:t>d=7.013mm</m:t>
+                </m:r>
+              </m:oMath>
+            </m:oMathPara>
+          </w:p>
+        </w:tc>
+      </w:tr>
+    </w:tbl>
+    <w:p>
+      <w:pPr>
+        <w:rPr>
+          <w:rFonts w:eastAsiaTheme="minorEastAsia"/>
+        </w:rPr>
+      </w:pPr>
+    </w:p>
+    <w:p>
+      <w:pPr>
+        <w:jc w:val="center"/>
+        <w:rPr>
+          <w:rFonts w:eastAsiaTheme="minorEastAsia"/>
+        </w:rPr>
+      </w:pPr>
+      <w:r>
+        <w:rPr>
+          <w:rFonts w:eastAsiaTheme="minorEastAsia"/>
+          <w:noProof/>
+        </w:rPr>
+        <w:lastRenderedPageBreak/>
+        <w:drawing>
+          <wp:inline distT="0" distB="0" distL="0" distR="0" wp14:anchorId="613B22D2" wp14:editId="23802D23">
+            <wp:extent cx="5943600" cy="2892427"/>
+            <wp:effectExtent l="0" t="0" r="0" b="3175"/>
+            <wp:docPr id="866271881" name="Picture 5"/>
+            <wp:cNvGraphicFramePr>
+              <a:graphicFrameLocks xmlns:a="http://schemas.openxmlformats.org/drawingml/2006/main" noChangeAspect="1"/>
+            </wp:cNvGraphicFramePr>
+            <a:graphic xmlns:a="http://schemas.openxmlformats.org/drawingml/2006/main">
+              <a:graphicData uri="http://schemas.openxmlformats.org/drawingml/2006/picture">
+                <pic:pic xmlns:pic="http://schemas.openxmlformats.org/drawingml/2006/picture">
+                  <pic:nvPicPr>
+                    <pic:cNvPr id="866271881" name="Picture 866271881"/>
+                    <pic:cNvPicPr/>
+                  </pic:nvPicPr>
+                  <pic:blipFill>
+                    <a:blip r:embed="rId15" cstate="print">
+                      <a:extLst>
+                        <a:ext uri="{28A0092B-C50C-407E-A947-70E740481C1C}">
+                          <a14:useLocalDpi xmlns:a14="http://schemas.microsoft.com/office/drawing/2010/main" val="0"/>
+                        </a:ext>
+                      </a:extLst>
+                    </a:blip>
+                    <a:stretch>
+                      <a:fillRect/>
+                    </a:stretch>
+                  </pic:blipFill>
+                  <pic:spPr>
+                    <a:xfrm>
+                      <a:off x="0" y="0"/>
+                      <a:ext cx="5943600" cy="2892427"/>
+                    </a:xfrm>
+                    <a:prstGeom prst="rect">
+                      <a:avLst/>
+                    </a:prstGeom>
+                  </pic:spPr>
+                </pic:pic>
+              </a:graphicData>
+            </a:graphic>
+          </wp:inline>
+        </w:drawing>
+      </w:r>
     </w:p>
     <w:p>
       <w:pPr>
@@ -3131,7 +4956,7 @@
   <w:style w:type="paragraph" w:default="1" w:styleId="Normal">
     <w:name w:val="Normal"/>
     <w:qFormat/>
-    <w:rsid w:val="000B7F7D"/>
+    <w:rsid w:val="006B7BEF"/>
   </w:style>
   <w:style w:type="paragraph" w:styleId="Heading1">
     <w:name w:val="heading 1"/>
@@ -3160,7 +4985,6 @@
     <w:next w:val="Normal"/>
     <w:link w:val="Heading2Char"/>
     <w:uiPriority w:val="9"/>
-    <w:semiHidden/>
     <w:unhideWhenUsed/>
     <w:qFormat/>
     <w:rsid w:val="00AC2147"/>
@@ -3377,7 +5201,6 @@
     <w:basedOn w:val="DefaultParagraphFont"/>
     <w:link w:val="Heading2"/>
     <w:uiPriority w:val="9"/>
-    <w:semiHidden/>
     <w:rsid w:val="00AC2147"/>
     <w:rPr>
       <w:rFonts w:asciiTheme="majorHAnsi" w:eastAsiaTheme="majorEastAsia" w:hAnsiTheme="majorHAnsi" w:cstheme="majorBidi"/>
@@ -3658,6 +5481,25 @@
     <w:rPr>
       <w:color w:val="666666"/>
     </w:rPr>
+  </w:style>
+  <w:style w:type="table" w:styleId="TableGrid">
+    <w:name w:val="Table Grid"/>
+    <w:basedOn w:val="TableNormal"/>
+    <w:uiPriority w:val="39"/>
+    <w:rsid w:val="00A7598E"/>
+    <w:pPr>
+      <w:spacing w:after="0" w:line="240" w:lineRule="auto"/>
+    </w:pPr>
+    <w:tblPr>
+      <w:tblBorders>
+        <w:top w:val="single" w:sz="4" w:space="0" w:color="auto"/>
+        <w:left w:val="single" w:sz="4" w:space="0" w:color="auto"/>
+        <w:bottom w:val="single" w:sz="4" w:space="0" w:color="auto"/>
+        <w:right w:val="single" w:sz="4" w:space="0" w:color="auto"/>
+        <w:insideH w:val="single" w:sz="4" w:space="0" w:color="auto"/>
+        <w:insideV w:val="single" w:sz="4" w:space="0" w:color="auto"/>
+      </w:tblBorders>
+    </w:tblPr>
   </w:style>
 </w:styles>
 </file>

</xml_diff>